<commit_message>
Setup React frontend with Vite
</commit_message>
<xml_diff>
--- a/docs/Hangman_requirments.docx
+++ b/docs/Hangman_requirments.docx
@@ -135,7 +135,7 @@
     <w:p>
       <w:r>
         <w:pict w14:anchorId="2FA5816A">
-          <v:rect id="_x0000_i1089" style="width:0;height:1.5pt" o:hralign="center" o:hrstd="t" o:hr="t" fillcolor="#a0a0a0" stroked="f"/>
+          <v:rect id="_x0000_i1025" style="width:0;height:1.5pt" o:hralign="center" o:hrstd="t" o:hr="t" fillcolor="#a0a0a0" stroked="f"/>
         </w:pict>
       </w:r>
     </w:p>
@@ -234,7 +234,7 @@
     <w:p>
       <w:r>
         <w:pict w14:anchorId="7B628A0F">
-          <v:rect id="_x0000_i1090" style="width:0;height:1.5pt" o:hralign="center" o:hrstd="t" o:hr="t" fillcolor="#a0a0a0" stroked="f"/>
+          <v:rect id="_x0000_i1026" style="width:0;height:1.5pt" o:hralign="center" o:hrstd="t" o:hr="t" fillcolor="#a0a0a0" stroked="f"/>
         </w:pict>
       </w:r>
     </w:p>
@@ -311,7 +311,7 @@
     <w:p>
       <w:r>
         <w:pict w14:anchorId="0E575764">
-          <v:rect id="_x0000_i1091" style="width:0;height:1.5pt" o:hralign="center" o:hrstd="t" o:hr="t" fillcolor="#a0a0a0" stroked="f"/>
+          <v:rect id="_x0000_i1027" style="width:0;height:1.5pt" o:hralign="center" o:hrstd="t" o:hr="t" fillcolor="#a0a0a0" stroked="f"/>
         </w:pict>
       </w:r>
     </w:p>
@@ -367,7 +367,7 @@
     <w:p>
       <w:r>
         <w:pict w14:anchorId="47C04735">
-          <v:rect id="_x0000_i1092" style="width:0;height:1.5pt" o:hralign="center" o:hrstd="t" o:hr="t" fillcolor="#a0a0a0" stroked="f"/>
+          <v:rect id="_x0000_i1028" style="width:0;height:1.5pt" o:hralign="center" o:hrstd="t" o:hr="t" fillcolor="#a0a0a0" stroked="f"/>
         </w:pict>
       </w:r>
     </w:p>
@@ -444,7 +444,7 @@
     <w:p>
       <w:r>
         <w:pict w14:anchorId="367898B7">
-          <v:rect id="_x0000_i1093" style="width:0;height:1.5pt" o:hralign="center" o:hrstd="t" o:hr="t" fillcolor="#a0a0a0" stroked="f"/>
+          <v:rect id="_x0000_i1029" style="width:0;height:1.5pt" o:hralign="center" o:hrstd="t" o:hr="t" fillcolor="#a0a0a0" stroked="f"/>
         </w:pict>
       </w:r>
     </w:p>
@@ -499,7 +499,7 @@
     <w:p>
       <w:r>
         <w:pict w14:anchorId="4B8783DD">
-          <v:rect id="_x0000_i1094" style="width:0;height:1.5pt" o:hralign="center" o:hrstd="t" o:hr="t" fillcolor="#a0a0a0" stroked="f"/>
+          <v:rect id="_x0000_i1030" style="width:0;height:1.5pt" o:hralign="center" o:hrstd="t" o:hr="t" fillcolor="#a0a0a0" stroked="f"/>
         </w:pict>
       </w:r>
     </w:p>
@@ -554,7 +554,7 @@
     <w:p>
       <w:r>
         <w:pict w14:anchorId="28DA97E4">
-          <v:rect id="_x0000_i1095" style="width:0;height:1.5pt" o:hralign="center" o:hrstd="t" o:hr="t" fillcolor="#a0a0a0" stroked="f"/>
+          <v:rect id="_x0000_i1031" style="width:0;height:1.5pt" o:hralign="center" o:hrstd="t" o:hr="t" fillcolor="#a0a0a0" stroked="f"/>
         </w:pict>
       </w:r>
     </w:p>
@@ -609,7 +609,7 @@
     <w:p>
       <w:r>
         <w:pict w14:anchorId="6501E12A">
-          <v:rect id="_x0000_i1096" style="width:0;height:1.5pt" o:hralign="center" o:hrstd="t" o:hr="t" fillcolor="#a0a0a0" stroked="f"/>
+          <v:rect id="_x0000_i1032" style="width:0;height:1.5pt" o:hralign="center" o:hrstd="t" o:hr="t" fillcolor="#a0a0a0" stroked="f"/>
         </w:pict>
       </w:r>
     </w:p>
@@ -823,6 +823,1143 @@
     <w:p>
       <w:r>
         <w:pict w14:anchorId="739B31B8">
+          <v:rect id="_x0000_i1033" style="width:0;height:1.5pt" o:hralign="center" o:hrstd="t" o:hr="t" fillcolor="#a0a0a0" stroked="f"/>
+        </w:pict>
+      </w:r>
+    </w:p>
+    <w:p>
+      <w:pPr>
+        <w:rPr>
+          <w:b/>
+          <w:bCs/>
+        </w:rPr>
+      </w:pPr>
+      <w:r>
+        <w:rPr>
+          <w:b/>
+          <w:bCs/>
+        </w:rPr>
+        <w:t>Backend</w:t>
+      </w:r>
+    </w:p>
+    <w:p>
+      <w:pPr>
+        <w:numPr>
+          <w:ilvl w:val="0"/>
+          <w:numId w:val="2"/>
+        </w:numPr>
+      </w:pPr>
+      <w:r>
+        <w:t xml:space="preserve">Django </w:t>
+      </w:r>
+    </w:p>
+    <w:p>
+      <w:pPr>
+        <w:numPr>
+          <w:ilvl w:val="0"/>
+          <w:numId w:val="2"/>
+        </w:numPr>
+      </w:pPr>
+      <w:r>
+        <w:t xml:space="preserve">Django REST Framework </w:t>
+      </w:r>
+    </w:p>
+    <w:p>
+      <w:pPr>
+        <w:numPr>
+          <w:ilvl w:val="0"/>
+          <w:numId w:val="2"/>
+        </w:numPr>
+      </w:pPr>
+      <w:r>
+        <w:t xml:space="preserve">Django Channels (for </w:t>
+      </w:r>
+      <w:proofErr w:type="spellStart"/>
+      <w:r>
+        <w:t>WebSockets</w:t>
+      </w:r>
+      <w:proofErr w:type="spellEnd"/>
+      <w:r>
+        <w:t xml:space="preserve">) </w:t>
+      </w:r>
+    </w:p>
+    <w:p>
+      <w:pPr>
+        <w:numPr>
+          <w:ilvl w:val="0"/>
+          <w:numId w:val="2"/>
+        </w:numPr>
+      </w:pPr>
+      <w:r>
+        <w:t xml:space="preserve">Redis (required for Channels in production and recommended for local development too) </w:t>
+      </w:r>
+    </w:p>
+    <w:p>
+      <w:pPr>
+        <w:numPr>
+          <w:ilvl w:val="0"/>
+          <w:numId w:val="2"/>
+        </w:numPr>
+      </w:pPr>
+      <w:r>
+        <w:t xml:space="preserve">PostgreSQL </w:t>
+      </w:r>
+    </w:p>
+    <w:p>
+      <w:r>
+        <w:pict w14:anchorId="23CF661E">
+          <v:rect id="_x0000_i1034" style="width:0;height:1.5pt" o:hralign="center" o:hrstd="t" o:hr="t" fillcolor="#a0a0a0" stroked="f"/>
+        </w:pict>
+      </w:r>
+    </w:p>
+    <w:p>
+      <w:pPr>
+        <w:rPr>
+          <w:b/>
+          <w:bCs/>
+        </w:rPr>
+      </w:pPr>
+      <w:r>
+        <w:rPr>
+          <w:b/>
+          <w:bCs/>
+        </w:rPr>
+        <w:t>Deployment</w:t>
+      </w:r>
+    </w:p>
+    <w:p>
+      <w:r>
+        <w:t>Frontend</w:t>
+      </w:r>
+    </w:p>
+    <w:p>
+      <w:pPr>
+        <w:numPr>
+          <w:ilvl w:val="0"/>
+          <w:numId w:val="3"/>
+        </w:numPr>
+      </w:pPr>
+      <w:proofErr w:type="spellStart"/>
+      <w:r>
+        <w:t>Vercel</w:t>
+      </w:r>
+      <w:proofErr w:type="spellEnd"/>
+      <w:r>
+        <w:t xml:space="preserve"> </w:t>
+      </w:r>
+    </w:p>
+    <w:p/>
+    <w:p>
+      <w:r>
+        <w:lastRenderedPageBreak/>
+        <w:t>Backend</w:t>
+      </w:r>
+    </w:p>
+    <w:p>
+      <w:pPr>
+        <w:numPr>
+          <w:ilvl w:val="0"/>
+          <w:numId w:val="4"/>
+        </w:numPr>
+      </w:pPr>
+      <w:r>
+        <w:t xml:space="preserve">Render </w:t>
+      </w:r>
+    </w:p>
+    <w:p>
+      <w:pPr>
+        <w:numPr>
+          <w:ilvl w:val="0"/>
+          <w:numId w:val="4"/>
+        </w:numPr>
+      </w:pPr>
+      <w:r>
+        <w:t xml:space="preserve">Railway </w:t>
+      </w:r>
+    </w:p>
+    <w:p>
+      <w:pPr>
+        <w:numPr>
+          <w:ilvl w:val="0"/>
+          <w:numId w:val="4"/>
+        </w:numPr>
+      </w:pPr>
+      <w:proofErr w:type="spellStart"/>
+      <w:r>
+        <w:t>DigitalOcean</w:t>
+      </w:r>
+      <w:proofErr w:type="spellEnd"/>
+      <w:r>
+        <w:t xml:space="preserve"> </w:t>
+      </w:r>
+    </w:p>
+    <w:p>
+      <w:r>
+        <w:t>Database</w:t>
+      </w:r>
+    </w:p>
+    <w:p>
+      <w:pPr>
+        <w:numPr>
+          <w:ilvl w:val="0"/>
+          <w:numId w:val="5"/>
+        </w:numPr>
+      </w:pPr>
+      <w:proofErr w:type="spellStart"/>
+      <w:r>
+        <w:t>Supabase</w:t>
+      </w:r>
+      <w:proofErr w:type="spellEnd"/>
+      <w:r>
+        <w:t xml:space="preserve"> PostgreSQL </w:t>
+      </w:r>
+    </w:p>
+    <w:p>
+      <w:pPr>
+        <w:numPr>
+          <w:ilvl w:val="0"/>
+          <w:numId w:val="5"/>
+        </w:numPr>
+      </w:pPr>
+      <w:r>
+        <w:t xml:space="preserve">Railway PostgreSQL </w:t>
+      </w:r>
+    </w:p>
+    <w:p>
+      <w:pPr>
+        <w:numPr>
+          <w:ilvl w:val="0"/>
+          <w:numId w:val="5"/>
+        </w:numPr>
+      </w:pPr>
+      <w:r>
+        <w:t xml:space="preserve">Neon </w:t>
+      </w:r>
+    </w:p>
+    <w:p>
+      <w:r>
+        <w:t>Redis</w:t>
+      </w:r>
+    </w:p>
+    <w:p>
+      <w:pPr>
+        <w:numPr>
+          <w:ilvl w:val="0"/>
+          <w:numId w:val="6"/>
+        </w:numPr>
+      </w:pPr>
+      <w:proofErr w:type="spellStart"/>
+      <w:r>
+        <w:t>Upstash</w:t>
+      </w:r>
+      <w:proofErr w:type="spellEnd"/>
+      <w:r>
+        <w:t xml:space="preserve"> Redis </w:t>
+      </w:r>
+    </w:p>
+    <w:p>
+      <w:pPr>
+        <w:numPr>
+          <w:ilvl w:val="0"/>
+          <w:numId w:val="6"/>
+        </w:numPr>
+      </w:pPr>
+      <w:r>
+        <w:t>Railway Redis</w:t>
+      </w:r>
+    </w:p>
+    <w:p>
+      <w:pPr>
+        <w:rPr>
+          <w:lang w:val="en-US"/>
+        </w:rPr>
+      </w:pPr>
+    </w:p>
+    <w:p>
+      <w:pPr>
+        <w:rPr>
+          <w:b/>
+          <w:bCs/>
+        </w:rPr>
+      </w:pPr>
+      <w:r>
+        <w:rPr>
+          <w:b/>
+          <w:bCs/>
+        </w:rPr>
+        <w:t>Functional Requirements (Finalized)</w:t>
+      </w:r>
+    </w:p>
+    <w:p>
+      <w:pPr>
+        <w:rPr>
+          <w:b/>
+          <w:bCs/>
+        </w:rPr>
+      </w:pPr>
+      <w:r>
+        <w:rPr>
+          <w:b/>
+          <w:bCs/>
+        </w:rPr>
+        <w:t>Rooms</w:t>
+      </w:r>
+    </w:p>
+    <w:p>
+      <w:pPr>
+        <w:numPr>
+          <w:ilvl w:val="0"/>
+          <w:numId w:val="16"/>
+        </w:numPr>
+      </w:pPr>
+      <w:r>
+        <w:rPr>
+          <w:rFonts w:ascii="Segoe UI Emoji" w:hAnsi="Segoe UI Emoji" w:cs="Segoe UI Emoji"/>
+        </w:rPr>
+        <w:t>✅</w:t>
+      </w:r>
+      <w:r>
+        <w:t xml:space="preserve"> Create room </w:t>
+      </w:r>
+    </w:p>
+    <w:p>
+      <w:pPr>
+        <w:numPr>
+          <w:ilvl w:val="0"/>
+          <w:numId w:val="16"/>
+        </w:numPr>
+      </w:pPr>
+      <w:r>
+        <w:rPr>
+          <w:rFonts w:ascii="Segoe UI Emoji" w:hAnsi="Segoe UI Emoji" w:cs="Segoe UI Emoji"/>
+        </w:rPr>
+        <w:t>✅</w:t>
+      </w:r>
+      <w:r>
+        <w:t xml:space="preserve"> Join room using room code </w:t>
+      </w:r>
+    </w:p>
+    <w:p>
+      <w:pPr>
+        <w:numPr>
+          <w:ilvl w:val="0"/>
+          <w:numId w:val="16"/>
+        </w:numPr>
+      </w:pPr>
+      <w:r>
+        <w:rPr>
+          <w:rFonts w:ascii="Segoe UI Emoji" w:hAnsi="Segoe UI Emoji" w:cs="Segoe UI Emoji"/>
+        </w:rPr>
+        <w:t>✅</w:t>
+      </w:r>
+      <w:r>
+        <w:t xml:space="preserve"> Maximum 2 players </w:t>
+      </w:r>
+    </w:p>
+    <w:p>
+      <w:pPr>
+        <w:numPr>
+          <w:ilvl w:val="0"/>
+          <w:numId w:val="16"/>
+        </w:numPr>
+      </w:pPr>
+      <w:r>
+        <w:rPr>
+          <w:rFonts w:ascii="Segoe UI Emoji" w:hAnsi="Segoe UI Emoji" w:cs="Segoe UI Emoji"/>
+        </w:rPr>
+        <w:t>✅</w:t>
+      </w:r>
+      <w:r>
+        <w:t xml:space="preserve"> Unlimited rounds until someone leaves </w:t>
+      </w:r>
+    </w:p>
+    <w:p>
+      <w:pPr>
+        <w:rPr>
+          <w:b/>
+          <w:bCs/>
+        </w:rPr>
+      </w:pPr>
+      <w:r>
+        <w:rPr>
+          <w:b/>
+          <w:bCs/>
+        </w:rPr>
+        <w:t>Gameplay</w:t>
+      </w:r>
+    </w:p>
+    <w:p>
+      <w:pPr>
+        <w:numPr>
+          <w:ilvl w:val="0"/>
+          <w:numId w:val="17"/>
+        </w:numPr>
+      </w:pPr>
+      <w:r>
+        <w:rPr>
+          <w:rFonts w:ascii="Segoe UI Emoji" w:hAnsi="Segoe UI Emoji" w:cs="Segoe UI Emoji"/>
+        </w:rPr>
+        <w:t>✅</w:t>
+      </w:r>
+      <w:r>
+        <w:t xml:space="preserve"> Alternate roles every round </w:t>
+      </w:r>
+    </w:p>
+    <w:p>
+      <w:pPr>
+        <w:numPr>
+          <w:ilvl w:val="0"/>
+          <w:numId w:val="17"/>
+        </w:numPr>
+      </w:pPr>
+      <w:r>
+        <w:rPr>
+          <w:rFonts w:ascii="Segoe UI Emoji" w:hAnsi="Segoe UI Emoji" w:cs="Segoe UI Emoji"/>
+        </w:rPr>
+        <w:t>✅</w:t>
+      </w:r>
+      <w:r>
+        <w:t xml:space="preserve"> Category chosen by one player </w:t>
+      </w:r>
+    </w:p>
+    <w:p>
+      <w:pPr>
+        <w:numPr>
+          <w:ilvl w:val="0"/>
+          <w:numId w:val="17"/>
+        </w:numPr>
+      </w:pPr>
+      <w:r>
+        <w:rPr>
+          <w:rFonts w:ascii="Segoe UI Emoji" w:hAnsi="Segoe UI Emoji" w:cs="Segoe UI Emoji"/>
+        </w:rPr>
+        <w:t>✅</w:t>
+      </w:r>
+      <w:r>
+        <w:t xml:space="preserve"> Secret word entered by the other </w:t>
+      </w:r>
+    </w:p>
+    <w:p>
+      <w:pPr>
+        <w:numPr>
+          <w:ilvl w:val="0"/>
+          <w:numId w:val="17"/>
+        </w:numPr>
+      </w:pPr>
+      <w:r>
+        <w:rPr>
+          <w:rFonts w:ascii="Segoe UI Emoji" w:hAnsi="Segoe UI Emoji" w:cs="Segoe UI Emoji"/>
+        </w:rPr>
+        <w:t>✅</w:t>
+      </w:r>
+      <w:r>
+        <w:t xml:space="preserve"> Guess one letter at a time </w:t>
+      </w:r>
+    </w:p>
+    <w:p>
+      <w:pPr>
+        <w:numPr>
+          <w:ilvl w:val="0"/>
+          <w:numId w:val="17"/>
+        </w:numPr>
+      </w:pPr>
+      <w:r>
+        <w:rPr>
+          <w:rFonts w:ascii="Segoe UI Emoji" w:hAnsi="Segoe UI Emoji" w:cs="Segoe UI Emoji"/>
+        </w:rPr>
+        <w:t>✅</w:t>
+      </w:r>
+      <w:r>
+        <w:t xml:space="preserve"> Correct letters reveal all matching positions </w:t>
+      </w:r>
+    </w:p>
+    <w:p>
+      <w:pPr>
+        <w:numPr>
+          <w:ilvl w:val="0"/>
+          <w:numId w:val="17"/>
+        </w:numPr>
+      </w:pPr>
+      <w:r>
+        <w:rPr>
+          <w:rFonts w:ascii="Segoe UI Emoji" w:hAnsi="Segoe UI Emoji" w:cs="Segoe UI Emoji"/>
+        </w:rPr>
+        <w:t>✅</w:t>
+      </w:r>
+      <w:r>
+        <w:t xml:space="preserve"> Wrong guesses reduce lives </w:t>
+      </w:r>
+    </w:p>
+    <w:p>
+      <w:pPr>
+        <w:numPr>
+          <w:ilvl w:val="0"/>
+          <w:numId w:val="17"/>
+        </w:numPr>
+      </w:pPr>
+      <w:r>
+        <w:rPr>
+          <w:rFonts w:ascii="Segoe UI Emoji" w:hAnsi="Segoe UI Emoji" w:cs="Segoe UI Emoji"/>
+        </w:rPr>
+        <w:t>✅</w:t>
+      </w:r>
+      <w:r>
+        <w:t xml:space="preserve"> 6 lives total </w:t>
+      </w:r>
+    </w:p>
+    <w:p>
+      <w:pPr>
+        <w:rPr>
+          <w:b/>
+          <w:bCs/>
+        </w:rPr>
+      </w:pPr>
+      <w:r>
+        <w:rPr>
+          <w:b/>
+          <w:bCs/>
+        </w:rPr>
+        <w:t>Clues</w:t>
+      </w:r>
+    </w:p>
+    <w:p>
+      <w:pPr>
+        <w:numPr>
+          <w:ilvl w:val="0"/>
+          <w:numId w:val="18"/>
+        </w:numPr>
+      </w:pPr>
+      <w:r>
+        <w:rPr>
+          <w:rFonts w:ascii="Segoe UI Emoji" w:hAnsi="Segoe UI Emoji" w:cs="Segoe UI Emoji"/>
+        </w:rPr>
+        <w:lastRenderedPageBreak/>
+        <w:t>✅</w:t>
+      </w:r>
+      <w:r>
+        <w:t xml:space="preserve"> Guesser requests a clue </w:t>
+      </w:r>
+    </w:p>
+    <w:p>
+      <w:pPr>
+        <w:numPr>
+          <w:ilvl w:val="0"/>
+          <w:numId w:val="18"/>
+        </w:numPr>
+      </w:pPr>
+      <w:r>
+        <w:rPr>
+          <w:rFonts w:ascii="Segoe UI Emoji" w:hAnsi="Segoe UI Emoji" w:cs="Segoe UI Emoji"/>
+        </w:rPr>
+        <w:t>✅</w:t>
+      </w:r>
+      <w:r>
+        <w:t xml:space="preserve"> Clue-giver types the clue after the request </w:t>
+      </w:r>
+    </w:p>
+    <w:p>
+      <w:pPr>
+        <w:numPr>
+          <w:ilvl w:val="0"/>
+          <w:numId w:val="18"/>
+        </w:numPr>
+      </w:pPr>
+      <w:r>
+        <w:rPr>
+          <w:rFonts w:ascii="Segoe UI Emoji" w:hAnsi="Segoe UI Emoji" w:cs="Segoe UI Emoji"/>
+        </w:rPr>
+        <w:t>✅</w:t>
+      </w:r>
+      <w:r>
+        <w:t xml:space="preserve"> Game continues while waiting </w:t>
+      </w:r>
+    </w:p>
+    <w:p>
+      <w:pPr>
+        <w:numPr>
+          <w:ilvl w:val="0"/>
+          <w:numId w:val="18"/>
+        </w:numPr>
+      </w:pPr>
+      <w:r>
+        <w:rPr>
+          <w:rFonts w:ascii="Segoe UI Emoji" w:hAnsi="Segoe UI Emoji" w:cs="Segoe UI Emoji"/>
+        </w:rPr>
+        <w:t>✅</w:t>
+      </w:r>
+      <w:r>
+        <w:t xml:space="preserve"> Clue appears instantly for both when submitted </w:t>
+      </w:r>
+    </w:p>
+    <w:p>
+      <w:pPr>
+        <w:rPr>
+          <w:b/>
+          <w:bCs/>
+        </w:rPr>
+      </w:pPr>
+      <w:r>
+        <w:rPr>
+          <w:b/>
+          <w:bCs/>
+        </w:rPr>
+        <w:t>Synchronization</w:t>
+      </w:r>
+    </w:p>
+    <w:p>
+      <w:r>
+        <w:t>Everything is synchronized in real time:</w:t>
+      </w:r>
+    </w:p>
+    <w:p>
+      <w:pPr>
+        <w:numPr>
+          <w:ilvl w:val="0"/>
+          <w:numId w:val="19"/>
+        </w:numPr>
+      </w:pPr>
+      <w:r>
+        <w:t xml:space="preserve">Room state </w:t>
+      </w:r>
+    </w:p>
+    <w:p>
+      <w:pPr>
+        <w:numPr>
+          <w:ilvl w:val="0"/>
+          <w:numId w:val="19"/>
+        </w:numPr>
+      </w:pPr>
+      <w:r>
+        <w:t xml:space="preserve">Player join/leave </w:t>
+      </w:r>
+    </w:p>
+    <w:p>
+      <w:pPr>
+        <w:numPr>
+          <w:ilvl w:val="0"/>
+          <w:numId w:val="19"/>
+        </w:numPr>
+      </w:pPr>
+      <w:r>
+        <w:t xml:space="preserve">Category </w:t>
+      </w:r>
+    </w:p>
+    <w:p>
+      <w:pPr>
+        <w:numPr>
+          <w:ilvl w:val="0"/>
+          <w:numId w:val="19"/>
+        </w:numPr>
+      </w:pPr>
+      <w:r>
+        <w:t xml:space="preserve">Secret word (hidden from guesser) </w:t>
+      </w:r>
+    </w:p>
+    <w:p>
+      <w:pPr>
+        <w:numPr>
+          <w:ilvl w:val="0"/>
+          <w:numId w:val="19"/>
+        </w:numPr>
+      </w:pPr>
+      <w:r>
+        <w:t xml:space="preserve">Letter guesses </w:t>
+      </w:r>
+    </w:p>
+    <w:p>
+      <w:pPr>
+        <w:numPr>
+          <w:ilvl w:val="0"/>
+          <w:numId w:val="19"/>
+        </w:numPr>
+      </w:pPr>
+      <w:r>
+        <w:t xml:space="preserve">Revealed letters </w:t>
+      </w:r>
+    </w:p>
+    <w:p>
+      <w:pPr>
+        <w:numPr>
+          <w:ilvl w:val="0"/>
+          <w:numId w:val="19"/>
+        </w:numPr>
+      </w:pPr>
+      <w:r>
+        <w:t xml:space="preserve">Wrong guesses </w:t>
+      </w:r>
+    </w:p>
+    <w:p>
+      <w:pPr>
+        <w:numPr>
+          <w:ilvl w:val="0"/>
+          <w:numId w:val="19"/>
+        </w:numPr>
+      </w:pPr>
+      <w:r>
+        <w:t xml:space="preserve">Hangman animation </w:t>
+      </w:r>
+    </w:p>
+    <w:p>
+      <w:pPr>
+        <w:numPr>
+          <w:ilvl w:val="0"/>
+          <w:numId w:val="19"/>
+        </w:numPr>
+      </w:pPr>
+      <w:r>
+        <w:t xml:space="preserve">Clues </w:t>
+      </w:r>
+    </w:p>
+    <w:p>
+      <w:pPr>
+        <w:numPr>
+          <w:ilvl w:val="0"/>
+          <w:numId w:val="19"/>
+        </w:numPr>
+      </w:pPr>
+      <w:r>
+        <w:t xml:space="preserve">Scores </w:t>
+      </w:r>
+    </w:p>
+    <w:p>
+      <w:pPr>
+        <w:numPr>
+          <w:ilvl w:val="0"/>
+          <w:numId w:val="19"/>
+        </w:numPr>
+      </w:pPr>
+      <w:r>
+        <w:t xml:space="preserve">Round changes </w:t>
+      </w:r>
+    </w:p>
+    <w:p>
+      <w:pPr>
+        <w:rPr>
+          <w:b/>
+          <w:bCs/>
+        </w:rPr>
+      </w:pPr>
+      <w:r>
+        <w:rPr>
+          <w:b/>
+          <w:bCs/>
+        </w:rPr>
+        <w:t>Scoring</w:t>
+      </w:r>
+    </w:p>
+    <w:p>
+      <w:pPr>
+        <w:numPr>
+          <w:ilvl w:val="0"/>
+          <w:numId w:val="20"/>
+        </w:numPr>
+      </w:pPr>
+      <w:r>
+        <w:rPr>
+          <w:rFonts w:ascii="Segoe UI Emoji" w:hAnsi="Segoe UI Emoji" w:cs="Segoe UI Emoji"/>
+        </w:rPr>
+        <w:t>✅</w:t>
+      </w:r>
+      <w:r>
+        <w:t xml:space="preserve"> Wins </w:t>
+      </w:r>
+    </w:p>
+    <w:p>
+      <w:pPr>
+        <w:numPr>
+          <w:ilvl w:val="0"/>
+          <w:numId w:val="20"/>
+        </w:numPr>
+      </w:pPr>
+      <w:r>
+        <w:rPr>
+          <w:rFonts w:ascii="Segoe UI Emoji" w:hAnsi="Segoe UI Emoji" w:cs="Segoe UI Emoji"/>
+        </w:rPr>
+        <w:t>✅</w:t>
+      </w:r>
+      <w:r>
+        <w:t xml:space="preserve"> Losses </w:t>
+      </w:r>
+    </w:p>
+    <w:p>
+      <w:pPr>
+        <w:numPr>
+          <w:ilvl w:val="0"/>
+          <w:numId w:val="20"/>
+        </w:numPr>
+      </w:pPr>
+      <w:r>
+        <w:rPr>
+          <w:rFonts w:ascii="Segoe UI Emoji" w:hAnsi="Segoe UI Emoji" w:cs="Segoe UI Emoji"/>
+        </w:rPr>
+        <w:t>✅</w:t>
+      </w:r>
+      <w:r>
+        <w:t xml:space="preserve"> Rounds played</w:t>
+      </w:r>
+    </w:p>
+    <w:p>
+      <w:pPr>
+        <w:rPr>
+          <w:b/>
+          <w:bCs/>
+        </w:rPr>
+      </w:pPr>
+      <w:r>
+        <w:rPr>
+          <w:rFonts w:ascii="Segoe UI Emoji" w:hAnsi="Segoe UI Emoji" w:cs="Segoe UI Emoji"/>
+          <w:b/>
+          <w:bCs/>
+        </w:rPr>
+        <w:t>✅</w:t>
+      </w:r>
+      <w:r>
+        <w:rPr>
+          <w:b/>
+          <w:bCs/>
+        </w:rPr>
+        <w:t xml:space="preserve"> Final Game Rules (Locked)</w:t>
+      </w:r>
+    </w:p>
+    <w:p>
+      <w:pPr>
+        <w:rPr>
+          <w:b/>
+          <w:bCs/>
+        </w:rPr>
+      </w:pPr>
+      <w:r>
+        <w:rPr>
+          <w:b/>
+          <w:bCs/>
+        </w:rPr>
+        <w:t>1. Guessing Letters</w:t>
+      </w:r>
+    </w:p>
+    <w:p>
+      <w:pPr>
+        <w:numPr>
+          <w:ilvl w:val="0"/>
+          <w:numId w:val="21"/>
+        </w:numPr>
+      </w:pPr>
+      <w:r>
+        <w:t xml:space="preserve">Player guesses </w:t>
+      </w:r>
+      <w:r>
+        <w:rPr>
+          <w:b/>
+          <w:bCs/>
+        </w:rPr>
+        <w:t>one letter</w:t>
+      </w:r>
+      <w:r>
+        <w:t xml:space="preserve">. </w:t>
+      </w:r>
+    </w:p>
+    <w:p>
+      <w:pPr>
+        <w:numPr>
+          <w:ilvl w:val="0"/>
+          <w:numId w:val="21"/>
+        </w:numPr>
+      </w:pPr>
+      <w:r>
+        <w:t xml:space="preserve">If correct → Reveal all occurrences. </w:t>
+      </w:r>
+    </w:p>
+    <w:p>
+      <w:pPr>
+        <w:numPr>
+          <w:ilvl w:val="0"/>
+          <w:numId w:val="21"/>
+        </w:numPr>
+      </w:pPr>
+      <w:r>
+        <w:t xml:space="preserve">If wrong → Lose </w:t>
+      </w:r>
+      <w:r>
+        <w:rPr>
+          <w:b/>
+          <w:bCs/>
+        </w:rPr>
+        <w:t>1 life</w:t>
+      </w:r>
+      <w:r>
+        <w:t xml:space="preserve">. </w:t>
+      </w:r>
+    </w:p>
+    <w:p>
+      <w:pPr>
+        <w:numPr>
+          <w:ilvl w:val="0"/>
+          <w:numId w:val="21"/>
+        </w:numPr>
+      </w:pPr>
+      <w:r>
+        <w:t xml:space="preserve">If already guessed → Show: </w:t>
+      </w:r>
+    </w:p>
+    <w:p>
+      <w:r>
+        <w:lastRenderedPageBreak/>
+        <w:t>"You've already guessed 'A'."</w:t>
+      </w:r>
+    </w:p>
+    <w:p>
+      <w:pPr>
+        <w:numPr>
+          <w:ilvl w:val="0"/>
+          <w:numId w:val="22"/>
+        </w:numPr>
+      </w:pPr>
+      <w:r>
+        <w:rPr>
+          <w:b/>
+          <w:bCs/>
+        </w:rPr>
+        <w:t>No life is deducted</w:t>
+      </w:r>
+      <w:r>
+        <w:t xml:space="preserve">. </w:t>
+      </w:r>
+    </w:p>
+    <w:p>
+      <w:r>
+        <w:pict w14:anchorId="773A96A2">
+          <v:rect id="_x0000_i1035" style="width:0;height:1.5pt" o:hralign="center" o:hrstd="t" o:hr="t" fillcolor="#a0a0a0" stroked="f"/>
+        </w:pict>
+      </w:r>
+    </w:p>
+    <w:p>
+      <w:pPr>
+        <w:rPr>
+          <w:b/>
+          <w:bCs/>
+        </w:rPr>
+      </w:pPr>
+      <w:r>
+        <w:rPr>
+          <w:b/>
+          <w:bCs/>
+        </w:rPr>
+        <w:t xml:space="preserve">2. Guessing the Entire Word </w:t>
+      </w:r>
+      <w:r>
+        <w:rPr>
+          <w:rFonts w:ascii="Segoe UI Emoji" w:hAnsi="Segoe UI Emoji" w:cs="Segoe UI Emoji"/>
+          <w:b/>
+          <w:bCs/>
+        </w:rPr>
+        <w:t>✅</w:t>
+      </w:r>
+    </w:p>
+    <w:p>
+      <w:r>
+        <w:t>Player can click:</w:t>
+      </w:r>
+    </w:p>
+    <w:p>
+      <w:r>
+        <w:t>Guess Word</w:t>
+      </w:r>
+    </w:p>
+    <w:p>
+      <w:r>
+        <w:t>A dialog appears:</w:t>
+      </w:r>
+    </w:p>
+    <w:p>
+      <w:r>
+        <w:t>Enter your guess</w:t>
+      </w:r>
+    </w:p>
+    <w:p/>
+    <w:p>
+      <w:r>
+        <w:t>____________________</w:t>
+      </w:r>
+    </w:p>
+    <w:p/>
+    <w:p>
+      <w:r>
+        <w:t>[Submit]</w:t>
+      </w:r>
+    </w:p>
+    <w:p>
+      <w:r>
+        <w:t>If correct:</w:t>
+      </w:r>
+    </w:p>
+    <w:p>
+      <w:r>
+        <w:rPr>
+          <w:rFonts w:ascii="Segoe UI Emoji" w:hAnsi="Segoe UI Emoji" w:cs="Segoe UI Emoji"/>
+        </w:rPr>
+        <w:t>🏆</w:t>
+      </w:r>
+      <w:r>
+        <w:t xml:space="preserve"> Win immediately.</w:t>
+      </w:r>
+    </w:p>
+    <w:p>
+      <w:r>
+        <w:t>If wrong:</w:t>
+      </w:r>
+    </w:p>
+    <w:p>
+      <w:r>
+        <w:rPr>
+          <w:rFonts w:ascii="Segoe UI Emoji" w:hAnsi="Segoe UI Emoji" w:cs="Segoe UI Emoji"/>
+        </w:rPr>
+        <w:t>❌</w:t>
+      </w:r>
+      <w:r>
+        <w:t xml:space="preserve"> Lose </w:t>
+      </w:r>
+      <w:r>
+        <w:rPr>
+          <w:b/>
+          <w:bCs/>
+        </w:rPr>
+        <w:t>1 life</w:t>
+      </w:r>
+      <w:r>
+        <w:t>.</w:t>
+      </w:r>
+    </w:p>
+    <w:p>
+      <w:r>
+        <w:t>Continue playing.</w:t>
+      </w:r>
+    </w:p>
+    <w:p>
+      <w:r>
+        <w:pict w14:anchorId="1DB1B685">
+          <v:rect id="_x0000_i1036" style="width:0;height:1.5pt" o:hralign="center" o:hrstd="t" o:hr="t" fillcolor="#a0a0a0" stroked="f"/>
+        </w:pict>
+      </w:r>
+    </w:p>
+    <w:p>
+      <w:pPr>
+        <w:rPr>
+          <w:b/>
+          <w:bCs/>
+        </w:rPr>
+      </w:pPr>
+      <w:r>
+        <w:rPr>
+          <w:b/>
+          <w:bCs/>
+        </w:rPr>
+        <w:t xml:space="preserve">3. Clues </w:t>
+      </w:r>
+      <w:r>
+        <w:rPr>
+          <w:rFonts w:ascii="Segoe UI Emoji" w:hAnsi="Segoe UI Emoji" w:cs="Segoe UI Emoji"/>
+          <w:b/>
+          <w:bCs/>
+        </w:rPr>
+        <w:t>✅</w:t>
+      </w:r>
+    </w:p>
+    <w:p>
+      <w:r>
+        <w:t>Maximum:</w:t>
+      </w:r>
+    </w:p>
+    <w:p>
+      <w:pPr>
+        <w:rPr>
+          <w:b/>
+          <w:bCs/>
+        </w:rPr>
+      </w:pPr>
+      <w:r>
+        <w:rPr>
+          <w:b/>
+          <w:bCs/>
+        </w:rPr>
+        <w:t>3 clues per round</w:t>
+      </w:r>
+    </w:p>
+    <w:p>
+      <w:r>
+        <w:t>Player presses</w:t>
+      </w:r>
+    </w:p>
+    <w:p>
+      <w:r>
+        <w:t>Ask For Clue</w:t>
+      </w:r>
+    </w:p>
+    <w:p>
+      <w:r>
+        <w:t>↓</w:t>
+      </w:r>
+    </w:p>
+    <w:p>
+      <w:r>
+        <w:t>Player 2 receives</w:t>
+      </w:r>
+    </w:p>
+    <w:p>
+      <w:r>
+        <w:t>Player requested a clue.</w:t>
+      </w:r>
+    </w:p>
+    <w:p/>
+    <w:p>
+      <w:r>
+        <w:t>Type clue</w:t>
+      </w:r>
+    </w:p>
+    <w:p/>
+    <w:p>
+      <w:r>
+        <w:t>______________</w:t>
+      </w:r>
+    </w:p>
+    <w:p/>
+    <w:p>
+      <w:r>
+        <w:t>[Send]</w:t>
+      </w:r>
+    </w:p>
+    <w:p>
+      <w:r>
+        <w:t>Game continues while Player 2 is typing.</w:t>
+      </w:r>
+    </w:p>
+    <w:p>
+      <w:r>
+        <w:t>When submitted</w:t>
+      </w:r>
+    </w:p>
+    <w:p>
+      <w:r>
+        <w:t>↓</w:t>
+      </w:r>
+    </w:p>
+    <w:p>
+      <w:r>
+        <w:t>Both players instantly see</w:t>
+      </w:r>
+    </w:p>
+    <w:p>
+      <w:r>
+        <w:t>Clue 1</w:t>
+      </w:r>
+    </w:p>
+    <w:p/>
+    <w:p>
+      <w:r>
+        <w:t>Released in 2014</w:t>
+      </w:r>
+    </w:p>
+    <w:p>
+      <w:r>
+        <w:pict w14:anchorId="45B3D4EC">
           <v:rect id="_x0000_i1037" style="width:0;height:1.5pt" o:hralign="center" o:hrstd="t" o:hr="t" fillcolor="#a0a0a0" stroked="f"/>
         </w:pict>
       </w:r>
@@ -839,75 +1976,92 @@
           <w:b/>
           <w:bCs/>
         </w:rPr>
-        <w:t>Backend</w:t>
-      </w:r>
-    </w:p>
-    <w:p>
-      <w:pPr>
-        <w:numPr>
-          <w:ilvl w:val="0"/>
-          <w:numId w:val="2"/>
-        </w:numPr>
-      </w:pPr>
-      <w:r>
-        <w:t xml:space="preserve">Django </w:t>
-      </w:r>
-    </w:p>
-    <w:p>
-      <w:pPr>
-        <w:numPr>
-          <w:ilvl w:val="0"/>
-          <w:numId w:val="2"/>
-        </w:numPr>
-      </w:pPr>
-      <w:r>
-        <w:t xml:space="preserve">Django REST Framework </w:t>
-      </w:r>
-    </w:p>
-    <w:p>
-      <w:pPr>
-        <w:numPr>
-          <w:ilvl w:val="0"/>
-          <w:numId w:val="2"/>
-        </w:numPr>
-      </w:pPr>
-      <w:r>
-        <w:t xml:space="preserve">Django Channels (for </w:t>
-      </w:r>
-      <w:proofErr w:type="spellStart"/>
-      <w:r>
-        <w:t>WebSockets</w:t>
-      </w:r>
-      <w:proofErr w:type="spellEnd"/>
-      <w:r>
-        <w:t xml:space="preserve">) </w:t>
-      </w:r>
-    </w:p>
-    <w:p>
-      <w:pPr>
-        <w:numPr>
-          <w:ilvl w:val="0"/>
-          <w:numId w:val="2"/>
-        </w:numPr>
-      </w:pPr>
-      <w:r>
-        <w:t xml:space="preserve">Redis (required for Channels in production and recommended for local development too) </w:t>
-      </w:r>
-    </w:p>
-    <w:p>
-      <w:pPr>
-        <w:numPr>
-          <w:ilvl w:val="0"/>
-          <w:numId w:val="2"/>
-        </w:numPr>
-      </w:pPr>
-      <w:r>
-        <w:t xml:space="preserve">PostgreSQL </w:t>
-      </w:r>
-    </w:p>
-    <w:p>
-      <w:r>
-        <w:pict w14:anchorId="23CF661E">
+        <w:t xml:space="preserve">4. Multiple Word Support </w:t>
+      </w:r>
+      <w:r>
+        <w:rPr>
+          <w:rFonts w:ascii="Segoe UI Emoji" w:hAnsi="Segoe UI Emoji" w:cs="Segoe UI Emoji"/>
+          <w:b/>
+          <w:bCs/>
+        </w:rPr>
+        <w:t>✅</w:t>
+      </w:r>
+    </w:p>
+    <w:p>
+      <w:r>
+        <w:t>This is a really nice feature.</w:t>
+      </w:r>
+    </w:p>
+    <w:p>
+      <w:r>
+        <w:t>Example</w:t>
+      </w:r>
+    </w:p>
+    <w:p>
+      <w:r>
+        <w:t>Secret word</w:t>
+      </w:r>
+    </w:p>
+    <w:p>
+      <w:r>
+        <w:t>HARRY POTTER</w:t>
+      </w:r>
+    </w:p>
+    <w:p>
+      <w:r>
+        <w:t>Player sees</w:t>
+      </w:r>
+    </w:p>
+    <w:p>
+      <w:r>
+        <w:t>_ _ _ _ _     _ _ _ _ _ _</w:t>
+      </w:r>
+    </w:p>
+    <w:p>
+      <w:r>
+        <w:t>Notice</w:t>
+      </w:r>
+    </w:p>
+    <w:p>
+      <w:r>
+        <w:t xml:space="preserve">The </w:t>
+      </w:r>
+      <w:r>
+        <w:rPr>
+          <w:b/>
+          <w:bCs/>
+        </w:rPr>
+        <w:t>space is visible from the beginning.</w:t>
+      </w:r>
+    </w:p>
+    <w:p>
+      <w:r>
+        <w:t>Same for</w:t>
+      </w:r>
+    </w:p>
+    <w:p>
+      <w:r>
+        <w:t>RED DEAD REDEMPTION</w:t>
+      </w:r>
+    </w:p>
+    <w:p>
+      <w:r>
+        <w:t>Display</w:t>
+      </w:r>
+    </w:p>
+    <w:p>
+      <w:r>
+        <w:t>_ _ _     _ _ _ _     _ _ _ _ _ _ _ _ _ _</w:t>
+      </w:r>
+    </w:p>
+    <w:p>
+      <w:r>
+        <w:t>No guessing required for spaces.</w:t>
+      </w:r>
+    </w:p>
+    <w:p>
+      <w:r>
+        <w:pict w14:anchorId="1EFC3BF3">
           <v:rect id="_x0000_i1038" style="width:0;height:1.5pt" o:hralign="center" o:hrstd="t" o:hr="t" fillcolor="#a0a0a0" stroked="f"/>
         </w:pict>
       </w:r>
@@ -924,1160 +2078,6 @@
           <w:b/>
           <w:bCs/>
         </w:rPr>
-        <w:t>Deployment</w:t>
-      </w:r>
-    </w:p>
-    <w:p>
-      <w:r>
-        <w:t>Frontend</w:t>
-      </w:r>
-    </w:p>
-    <w:p>
-      <w:pPr>
-        <w:numPr>
-          <w:ilvl w:val="0"/>
-          <w:numId w:val="3"/>
-        </w:numPr>
-      </w:pPr>
-      <w:proofErr w:type="spellStart"/>
-      <w:r>
-        <w:t>Vercel</w:t>
-      </w:r>
-      <w:proofErr w:type="spellEnd"/>
-      <w:r>
-        <w:t xml:space="preserve"> </w:t>
-      </w:r>
-    </w:p>
-    <w:p/>
-    <w:p>
-      <w:r>
-        <w:lastRenderedPageBreak/>
-        <w:t>Backend</w:t>
-      </w:r>
-    </w:p>
-    <w:p>
-      <w:pPr>
-        <w:numPr>
-          <w:ilvl w:val="0"/>
-          <w:numId w:val="4"/>
-        </w:numPr>
-      </w:pPr>
-      <w:r>
-        <w:t xml:space="preserve">Render </w:t>
-      </w:r>
-    </w:p>
-    <w:p>
-      <w:pPr>
-        <w:numPr>
-          <w:ilvl w:val="0"/>
-          <w:numId w:val="4"/>
-        </w:numPr>
-      </w:pPr>
-      <w:r>
-        <w:t xml:space="preserve">Railway </w:t>
-      </w:r>
-    </w:p>
-    <w:p>
-      <w:pPr>
-        <w:numPr>
-          <w:ilvl w:val="0"/>
-          <w:numId w:val="4"/>
-        </w:numPr>
-      </w:pPr>
-      <w:proofErr w:type="spellStart"/>
-      <w:r>
-        <w:t>DigitalOcean</w:t>
-      </w:r>
-      <w:proofErr w:type="spellEnd"/>
-      <w:r>
-        <w:t xml:space="preserve"> </w:t>
-      </w:r>
-    </w:p>
-    <w:p>
-      <w:r>
-        <w:t>Database</w:t>
-      </w:r>
-    </w:p>
-    <w:p>
-      <w:pPr>
-        <w:numPr>
-          <w:ilvl w:val="0"/>
-          <w:numId w:val="5"/>
-        </w:numPr>
-      </w:pPr>
-      <w:proofErr w:type="spellStart"/>
-      <w:r>
-        <w:t>Supabase</w:t>
-      </w:r>
-      <w:proofErr w:type="spellEnd"/>
-      <w:r>
-        <w:t xml:space="preserve"> PostgreSQL </w:t>
-      </w:r>
-    </w:p>
-    <w:p>
-      <w:pPr>
-        <w:numPr>
-          <w:ilvl w:val="0"/>
-          <w:numId w:val="5"/>
-        </w:numPr>
-      </w:pPr>
-      <w:r>
-        <w:t xml:space="preserve">Railway PostgreSQL </w:t>
-      </w:r>
-    </w:p>
-    <w:p>
-      <w:pPr>
-        <w:numPr>
-          <w:ilvl w:val="0"/>
-          <w:numId w:val="5"/>
-        </w:numPr>
-      </w:pPr>
-      <w:r>
-        <w:t xml:space="preserve">Neon </w:t>
-      </w:r>
-    </w:p>
-    <w:p>
-      <w:r>
-        <w:t>Redis</w:t>
-      </w:r>
-    </w:p>
-    <w:p>
-      <w:pPr>
-        <w:numPr>
-          <w:ilvl w:val="0"/>
-          <w:numId w:val="6"/>
-        </w:numPr>
-      </w:pPr>
-      <w:proofErr w:type="spellStart"/>
-      <w:r>
-        <w:t>Upstash</w:t>
-      </w:r>
-      <w:proofErr w:type="spellEnd"/>
-      <w:r>
-        <w:t xml:space="preserve"> Redis </w:t>
-      </w:r>
-    </w:p>
-    <w:p>
-      <w:pPr>
-        <w:numPr>
-          <w:ilvl w:val="0"/>
-          <w:numId w:val="6"/>
-        </w:numPr>
-      </w:pPr>
-      <w:r>
-        <w:t>Railway Redis</w:t>
-      </w:r>
-    </w:p>
-    <w:p>
-      <w:pPr>
-        <w:rPr>
-          <w:lang w:val="en-US"/>
-        </w:rPr>
-      </w:pPr>
-    </w:p>
-    <w:p>
-      <w:pPr>
-        <w:rPr>
-          <w:b/>
-          <w:bCs/>
-        </w:rPr>
-      </w:pPr>
-      <w:r>
-        <w:rPr>
-          <w:b/>
-          <w:bCs/>
-        </w:rPr>
-        <w:t>Functional Requirements (Finalized)</w:t>
-      </w:r>
-    </w:p>
-    <w:p>
-      <w:pPr>
-        <w:rPr>
-          <w:b/>
-          <w:bCs/>
-        </w:rPr>
-      </w:pPr>
-      <w:r>
-        <w:rPr>
-          <w:b/>
-          <w:bCs/>
-        </w:rPr>
-        <w:t>Rooms</w:t>
-      </w:r>
-    </w:p>
-    <w:p>
-      <w:pPr>
-        <w:numPr>
-          <w:ilvl w:val="0"/>
-          <w:numId w:val="16"/>
-        </w:numPr>
-      </w:pPr>
-      <w:r>
-        <w:rPr>
-          <w:rFonts w:ascii="Segoe UI Emoji" w:hAnsi="Segoe UI Emoji" w:cs="Segoe UI Emoji"/>
-        </w:rPr>
-        <w:t>✅</w:t>
-      </w:r>
-      <w:r>
-        <w:t xml:space="preserve"> Create room </w:t>
-      </w:r>
-    </w:p>
-    <w:p>
-      <w:pPr>
-        <w:numPr>
-          <w:ilvl w:val="0"/>
-          <w:numId w:val="16"/>
-        </w:numPr>
-      </w:pPr>
-      <w:r>
-        <w:rPr>
-          <w:rFonts w:ascii="Segoe UI Emoji" w:hAnsi="Segoe UI Emoji" w:cs="Segoe UI Emoji"/>
-        </w:rPr>
-        <w:t>✅</w:t>
-      </w:r>
-      <w:r>
-        <w:t xml:space="preserve"> Join room using room code </w:t>
-      </w:r>
-    </w:p>
-    <w:p>
-      <w:pPr>
-        <w:numPr>
-          <w:ilvl w:val="0"/>
-          <w:numId w:val="16"/>
-        </w:numPr>
-      </w:pPr>
-      <w:r>
-        <w:rPr>
-          <w:rFonts w:ascii="Segoe UI Emoji" w:hAnsi="Segoe UI Emoji" w:cs="Segoe UI Emoji"/>
-        </w:rPr>
-        <w:t>✅</w:t>
-      </w:r>
-      <w:r>
-        <w:t xml:space="preserve"> Maximum 2 players </w:t>
-      </w:r>
-    </w:p>
-    <w:p>
-      <w:pPr>
-        <w:numPr>
-          <w:ilvl w:val="0"/>
-          <w:numId w:val="16"/>
-        </w:numPr>
-      </w:pPr>
-      <w:r>
-        <w:rPr>
-          <w:rFonts w:ascii="Segoe UI Emoji" w:hAnsi="Segoe UI Emoji" w:cs="Segoe UI Emoji"/>
-        </w:rPr>
-        <w:t>✅</w:t>
-      </w:r>
-      <w:r>
-        <w:t xml:space="preserve"> Unlimited rounds until someone leaves </w:t>
-      </w:r>
-    </w:p>
-    <w:p>
-      <w:pPr>
-        <w:rPr>
-          <w:b/>
-          <w:bCs/>
-        </w:rPr>
-      </w:pPr>
-      <w:r>
-        <w:rPr>
-          <w:b/>
-          <w:bCs/>
-        </w:rPr>
-        <w:t>Gameplay</w:t>
-      </w:r>
-    </w:p>
-    <w:p>
-      <w:pPr>
-        <w:numPr>
-          <w:ilvl w:val="0"/>
-          <w:numId w:val="17"/>
-        </w:numPr>
-      </w:pPr>
-      <w:r>
-        <w:rPr>
-          <w:rFonts w:ascii="Segoe UI Emoji" w:hAnsi="Segoe UI Emoji" w:cs="Segoe UI Emoji"/>
-        </w:rPr>
-        <w:t>✅</w:t>
-      </w:r>
-      <w:r>
-        <w:t xml:space="preserve"> Alternate roles every round </w:t>
-      </w:r>
-    </w:p>
-    <w:p>
-      <w:pPr>
-        <w:numPr>
-          <w:ilvl w:val="0"/>
-          <w:numId w:val="17"/>
-        </w:numPr>
-      </w:pPr>
-      <w:r>
-        <w:rPr>
-          <w:rFonts w:ascii="Segoe UI Emoji" w:hAnsi="Segoe UI Emoji" w:cs="Segoe UI Emoji"/>
-        </w:rPr>
-        <w:t>✅</w:t>
-      </w:r>
-      <w:r>
-        <w:t xml:space="preserve"> Category chosen by one player </w:t>
-      </w:r>
-    </w:p>
-    <w:p>
-      <w:pPr>
-        <w:numPr>
-          <w:ilvl w:val="0"/>
-          <w:numId w:val="17"/>
-        </w:numPr>
-      </w:pPr>
-      <w:r>
-        <w:rPr>
-          <w:rFonts w:ascii="Segoe UI Emoji" w:hAnsi="Segoe UI Emoji" w:cs="Segoe UI Emoji"/>
-        </w:rPr>
-        <w:t>✅</w:t>
-      </w:r>
-      <w:r>
-        <w:t xml:space="preserve"> Secret word entered by the other </w:t>
-      </w:r>
-    </w:p>
-    <w:p>
-      <w:pPr>
-        <w:numPr>
-          <w:ilvl w:val="0"/>
-          <w:numId w:val="17"/>
-        </w:numPr>
-      </w:pPr>
-      <w:r>
-        <w:rPr>
-          <w:rFonts w:ascii="Segoe UI Emoji" w:hAnsi="Segoe UI Emoji" w:cs="Segoe UI Emoji"/>
-        </w:rPr>
-        <w:t>✅</w:t>
-      </w:r>
-      <w:r>
-        <w:t xml:space="preserve"> Guess one letter at a time </w:t>
-      </w:r>
-    </w:p>
-    <w:p>
-      <w:pPr>
-        <w:numPr>
-          <w:ilvl w:val="0"/>
-          <w:numId w:val="17"/>
-        </w:numPr>
-      </w:pPr>
-      <w:r>
-        <w:rPr>
-          <w:rFonts w:ascii="Segoe UI Emoji" w:hAnsi="Segoe UI Emoji" w:cs="Segoe UI Emoji"/>
-        </w:rPr>
-        <w:t>✅</w:t>
-      </w:r>
-      <w:r>
-        <w:t xml:space="preserve"> Correct letters reveal all matching positions </w:t>
-      </w:r>
-    </w:p>
-    <w:p>
-      <w:pPr>
-        <w:numPr>
-          <w:ilvl w:val="0"/>
-          <w:numId w:val="17"/>
-        </w:numPr>
-      </w:pPr>
-      <w:r>
-        <w:rPr>
-          <w:rFonts w:ascii="Segoe UI Emoji" w:hAnsi="Segoe UI Emoji" w:cs="Segoe UI Emoji"/>
-        </w:rPr>
-        <w:t>✅</w:t>
-      </w:r>
-      <w:r>
-        <w:t xml:space="preserve"> Wrong guesses reduce lives </w:t>
-      </w:r>
-    </w:p>
-    <w:p>
-      <w:pPr>
-        <w:numPr>
-          <w:ilvl w:val="0"/>
-          <w:numId w:val="17"/>
-        </w:numPr>
-      </w:pPr>
-      <w:r>
-        <w:rPr>
-          <w:rFonts w:ascii="Segoe UI Emoji" w:hAnsi="Segoe UI Emoji" w:cs="Segoe UI Emoji"/>
-        </w:rPr>
-        <w:t>✅</w:t>
-      </w:r>
-      <w:r>
-        <w:t xml:space="preserve"> 6 lives total </w:t>
-      </w:r>
-    </w:p>
-    <w:p>
-      <w:pPr>
-        <w:rPr>
-          <w:b/>
-          <w:bCs/>
-        </w:rPr>
-      </w:pPr>
-      <w:r>
-        <w:rPr>
-          <w:b/>
-          <w:bCs/>
-        </w:rPr>
-        <w:t>Clues</w:t>
-      </w:r>
-    </w:p>
-    <w:p>
-      <w:pPr>
-        <w:numPr>
-          <w:ilvl w:val="0"/>
-          <w:numId w:val="18"/>
-        </w:numPr>
-      </w:pPr>
-      <w:r>
-        <w:rPr>
-          <w:rFonts w:ascii="Segoe UI Emoji" w:hAnsi="Segoe UI Emoji" w:cs="Segoe UI Emoji"/>
-        </w:rPr>
-        <w:lastRenderedPageBreak/>
-        <w:t>✅</w:t>
-      </w:r>
-      <w:r>
-        <w:t xml:space="preserve"> Guesser requests a clue </w:t>
-      </w:r>
-    </w:p>
-    <w:p>
-      <w:pPr>
-        <w:numPr>
-          <w:ilvl w:val="0"/>
-          <w:numId w:val="18"/>
-        </w:numPr>
-      </w:pPr>
-      <w:r>
-        <w:rPr>
-          <w:rFonts w:ascii="Segoe UI Emoji" w:hAnsi="Segoe UI Emoji" w:cs="Segoe UI Emoji"/>
-        </w:rPr>
-        <w:t>✅</w:t>
-      </w:r>
-      <w:r>
-        <w:t xml:space="preserve"> Clue-giver types the clue after the request </w:t>
-      </w:r>
-    </w:p>
-    <w:p>
-      <w:pPr>
-        <w:numPr>
-          <w:ilvl w:val="0"/>
-          <w:numId w:val="18"/>
-        </w:numPr>
-      </w:pPr>
-      <w:r>
-        <w:rPr>
-          <w:rFonts w:ascii="Segoe UI Emoji" w:hAnsi="Segoe UI Emoji" w:cs="Segoe UI Emoji"/>
-        </w:rPr>
-        <w:t>✅</w:t>
-      </w:r>
-      <w:r>
-        <w:t xml:space="preserve"> Game continues while waiting </w:t>
-      </w:r>
-    </w:p>
-    <w:p>
-      <w:pPr>
-        <w:numPr>
-          <w:ilvl w:val="0"/>
-          <w:numId w:val="18"/>
-        </w:numPr>
-      </w:pPr>
-      <w:r>
-        <w:rPr>
-          <w:rFonts w:ascii="Segoe UI Emoji" w:hAnsi="Segoe UI Emoji" w:cs="Segoe UI Emoji"/>
-        </w:rPr>
-        <w:t>✅</w:t>
-      </w:r>
-      <w:r>
-        <w:t xml:space="preserve"> Clue appears instantly for both when submitted </w:t>
-      </w:r>
-    </w:p>
-    <w:p>
-      <w:pPr>
-        <w:rPr>
-          <w:b/>
-          <w:bCs/>
-        </w:rPr>
-      </w:pPr>
-      <w:r>
-        <w:rPr>
-          <w:b/>
-          <w:bCs/>
-        </w:rPr>
-        <w:t>Synchronization</w:t>
-      </w:r>
-    </w:p>
-    <w:p>
-      <w:r>
-        <w:t>Everything is synchronized in real time:</w:t>
-      </w:r>
-    </w:p>
-    <w:p>
-      <w:pPr>
-        <w:numPr>
-          <w:ilvl w:val="0"/>
-          <w:numId w:val="19"/>
-        </w:numPr>
-      </w:pPr>
-      <w:r>
-        <w:t xml:space="preserve">Room state </w:t>
-      </w:r>
-    </w:p>
-    <w:p>
-      <w:pPr>
-        <w:numPr>
-          <w:ilvl w:val="0"/>
-          <w:numId w:val="19"/>
-        </w:numPr>
-      </w:pPr>
-      <w:r>
-        <w:t xml:space="preserve">Player join/leave </w:t>
-      </w:r>
-    </w:p>
-    <w:p>
-      <w:pPr>
-        <w:numPr>
-          <w:ilvl w:val="0"/>
-          <w:numId w:val="19"/>
-        </w:numPr>
-      </w:pPr>
-      <w:r>
-        <w:t xml:space="preserve">Category </w:t>
-      </w:r>
-    </w:p>
-    <w:p>
-      <w:pPr>
-        <w:numPr>
-          <w:ilvl w:val="0"/>
-          <w:numId w:val="19"/>
-        </w:numPr>
-      </w:pPr>
-      <w:r>
-        <w:t xml:space="preserve">Secret word (hidden from guesser) </w:t>
-      </w:r>
-    </w:p>
-    <w:p>
-      <w:pPr>
-        <w:numPr>
-          <w:ilvl w:val="0"/>
-          <w:numId w:val="19"/>
-        </w:numPr>
-      </w:pPr>
-      <w:r>
-        <w:t xml:space="preserve">Letter guesses </w:t>
-      </w:r>
-    </w:p>
-    <w:p>
-      <w:pPr>
-        <w:numPr>
-          <w:ilvl w:val="0"/>
-          <w:numId w:val="19"/>
-        </w:numPr>
-      </w:pPr>
-      <w:r>
-        <w:t xml:space="preserve">Revealed letters </w:t>
-      </w:r>
-    </w:p>
-    <w:p>
-      <w:pPr>
-        <w:numPr>
-          <w:ilvl w:val="0"/>
-          <w:numId w:val="19"/>
-        </w:numPr>
-      </w:pPr>
-      <w:r>
-        <w:t xml:space="preserve">Wrong guesses </w:t>
-      </w:r>
-    </w:p>
-    <w:p>
-      <w:pPr>
-        <w:numPr>
-          <w:ilvl w:val="0"/>
-          <w:numId w:val="19"/>
-        </w:numPr>
-      </w:pPr>
-      <w:r>
-        <w:t xml:space="preserve">Hangman animation </w:t>
-      </w:r>
-    </w:p>
-    <w:p>
-      <w:pPr>
-        <w:numPr>
-          <w:ilvl w:val="0"/>
-          <w:numId w:val="19"/>
-        </w:numPr>
-      </w:pPr>
-      <w:r>
-        <w:t xml:space="preserve">Clues </w:t>
-      </w:r>
-    </w:p>
-    <w:p>
-      <w:pPr>
-        <w:numPr>
-          <w:ilvl w:val="0"/>
-          <w:numId w:val="19"/>
-        </w:numPr>
-      </w:pPr>
-      <w:r>
-        <w:t xml:space="preserve">Scores </w:t>
-      </w:r>
-    </w:p>
-    <w:p>
-      <w:pPr>
-        <w:numPr>
-          <w:ilvl w:val="0"/>
-          <w:numId w:val="19"/>
-        </w:numPr>
-      </w:pPr>
-      <w:r>
-        <w:t xml:space="preserve">Round changes </w:t>
-      </w:r>
-    </w:p>
-    <w:p>
-      <w:pPr>
-        <w:rPr>
-          <w:b/>
-          <w:bCs/>
-        </w:rPr>
-      </w:pPr>
-      <w:r>
-        <w:rPr>
-          <w:b/>
-          <w:bCs/>
-        </w:rPr>
-        <w:t>Scoring</w:t>
-      </w:r>
-    </w:p>
-    <w:p>
-      <w:pPr>
-        <w:numPr>
-          <w:ilvl w:val="0"/>
-          <w:numId w:val="20"/>
-        </w:numPr>
-      </w:pPr>
-      <w:r>
-        <w:rPr>
-          <w:rFonts w:ascii="Segoe UI Emoji" w:hAnsi="Segoe UI Emoji" w:cs="Segoe UI Emoji"/>
-        </w:rPr>
-        <w:t>✅</w:t>
-      </w:r>
-      <w:r>
-        <w:t xml:space="preserve"> Wins </w:t>
-      </w:r>
-    </w:p>
-    <w:p>
-      <w:pPr>
-        <w:numPr>
-          <w:ilvl w:val="0"/>
-          <w:numId w:val="20"/>
-        </w:numPr>
-      </w:pPr>
-      <w:r>
-        <w:rPr>
-          <w:rFonts w:ascii="Segoe UI Emoji" w:hAnsi="Segoe UI Emoji" w:cs="Segoe UI Emoji"/>
-        </w:rPr>
-        <w:t>✅</w:t>
-      </w:r>
-      <w:r>
-        <w:t xml:space="preserve"> Losses </w:t>
-      </w:r>
-    </w:p>
-    <w:p>
-      <w:pPr>
-        <w:numPr>
-          <w:ilvl w:val="0"/>
-          <w:numId w:val="20"/>
-        </w:numPr>
-      </w:pPr>
-      <w:r>
-        <w:rPr>
-          <w:rFonts w:ascii="Segoe UI Emoji" w:hAnsi="Segoe UI Emoji" w:cs="Segoe UI Emoji"/>
-        </w:rPr>
-        <w:t>✅</w:t>
-      </w:r>
-      <w:r>
-        <w:t xml:space="preserve"> Rounds played</w:t>
-      </w:r>
-    </w:p>
-    <w:p>
-      <w:pPr>
-        <w:rPr>
-          <w:b/>
-          <w:bCs/>
-        </w:rPr>
-      </w:pPr>
-      <w:r>
-        <w:rPr>
-          <w:rFonts w:ascii="Segoe UI Emoji" w:hAnsi="Segoe UI Emoji" w:cs="Segoe UI Emoji"/>
-          <w:b/>
-          <w:bCs/>
-        </w:rPr>
-        <w:t>✅</w:t>
-      </w:r>
-      <w:r>
-        <w:rPr>
-          <w:b/>
-          <w:bCs/>
-        </w:rPr>
-        <w:t xml:space="preserve"> Final Game Rules (Locked)</w:t>
-      </w:r>
-    </w:p>
-    <w:p>
-      <w:pPr>
-        <w:rPr>
-          <w:b/>
-          <w:bCs/>
-        </w:rPr>
-      </w:pPr>
-      <w:r>
-        <w:rPr>
-          <w:b/>
-          <w:bCs/>
-        </w:rPr>
-        <w:t>1. Guessing Letters</w:t>
-      </w:r>
-    </w:p>
-    <w:p>
-      <w:pPr>
-        <w:numPr>
-          <w:ilvl w:val="0"/>
-          <w:numId w:val="21"/>
-        </w:numPr>
-      </w:pPr>
-      <w:r>
-        <w:t xml:space="preserve">Player guesses </w:t>
-      </w:r>
-      <w:r>
-        <w:rPr>
-          <w:b/>
-          <w:bCs/>
-        </w:rPr>
-        <w:t>one letter</w:t>
-      </w:r>
-      <w:r>
-        <w:t xml:space="preserve">. </w:t>
-      </w:r>
-    </w:p>
-    <w:p>
-      <w:pPr>
-        <w:numPr>
-          <w:ilvl w:val="0"/>
-          <w:numId w:val="21"/>
-        </w:numPr>
-      </w:pPr>
-      <w:r>
-        <w:t xml:space="preserve">If correct → Reveal all occurrences. </w:t>
-      </w:r>
-    </w:p>
-    <w:p>
-      <w:pPr>
-        <w:numPr>
-          <w:ilvl w:val="0"/>
-          <w:numId w:val="21"/>
-        </w:numPr>
-      </w:pPr>
-      <w:r>
-        <w:t xml:space="preserve">If wrong → Lose </w:t>
-      </w:r>
-      <w:r>
-        <w:rPr>
-          <w:b/>
-          <w:bCs/>
-        </w:rPr>
-        <w:t>1 life</w:t>
-      </w:r>
-      <w:r>
-        <w:t xml:space="preserve">. </w:t>
-      </w:r>
-    </w:p>
-    <w:p>
-      <w:pPr>
-        <w:numPr>
-          <w:ilvl w:val="0"/>
-          <w:numId w:val="21"/>
-        </w:numPr>
-      </w:pPr>
-      <w:r>
-        <w:t xml:space="preserve">If already guessed → Show: </w:t>
-      </w:r>
-    </w:p>
-    <w:p>
-      <w:r>
-        <w:lastRenderedPageBreak/>
-        <w:t>"You've already guessed 'A'."</w:t>
-      </w:r>
-    </w:p>
-    <w:p>
-      <w:pPr>
-        <w:numPr>
-          <w:ilvl w:val="0"/>
-          <w:numId w:val="22"/>
-        </w:numPr>
-      </w:pPr>
-      <w:r>
-        <w:rPr>
-          <w:b/>
-          <w:bCs/>
-        </w:rPr>
-        <w:t>No life is deducted</w:t>
-      </w:r>
-      <w:r>
-        <w:t xml:space="preserve">. </w:t>
-      </w:r>
-    </w:p>
-    <w:p>
-      <w:r>
-        <w:pict w14:anchorId="773A96A2">
-          <v:rect id="_x0000_i1147" style="width:0;height:1.5pt" o:hralign="center" o:hrstd="t" o:hr="t" fillcolor="#a0a0a0" stroked="f"/>
-        </w:pict>
-      </w:r>
-    </w:p>
-    <w:p>
-      <w:pPr>
-        <w:rPr>
-          <w:b/>
-          <w:bCs/>
-        </w:rPr>
-      </w:pPr>
-      <w:r>
-        <w:rPr>
-          <w:b/>
-          <w:bCs/>
-        </w:rPr>
-        <w:t xml:space="preserve">2. Guessing the Entire Word </w:t>
-      </w:r>
-      <w:r>
-        <w:rPr>
-          <w:rFonts w:ascii="Segoe UI Emoji" w:hAnsi="Segoe UI Emoji" w:cs="Segoe UI Emoji"/>
-          <w:b/>
-          <w:bCs/>
-        </w:rPr>
-        <w:t>✅</w:t>
-      </w:r>
-    </w:p>
-    <w:p>
-      <w:r>
-        <w:t>Player can click:</w:t>
-      </w:r>
-    </w:p>
-    <w:p>
-      <w:r>
-        <w:t>Guess Word</w:t>
-      </w:r>
-    </w:p>
-    <w:p>
-      <w:r>
-        <w:t>A dialog appears:</w:t>
-      </w:r>
-    </w:p>
-    <w:p>
-      <w:r>
-        <w:t>Enter your guess</w:t>
-      </w:r>
-    </w:p>
-    <w:p/>
-    <w:p>
-      <w:r>
-        <w:t>____________________</w:t>
-      </w:r>
-    </w:p>
-    <w:p/>
-    <w:p>
-      <w:r>
-        <w:t>[Submit]</w:t>
-      </w:r>
-    </w:p>
-    <w:p>
-      <w:r>
-        <w:t>If correct:</w:t>
-      </w:r>
-    </w:p>
-    <w:p>
-      <w:r>
-        <w:rPr>
-          <w:rFonts w:ascii="Segoe UI Emoji" w:hAnsi="Segoe UI Emoji" w:cs="Segoe UI Emoji"/>
-        </w:rPr>
-        <w:t>🏆</w:t>
-      </w:r>
-      <w:r>
-        <w:t xml:space="preserve"> Win immediately.</w:t>
-      </w:r>
-    </w:p>
-    <w:p>
-      <w:r>
-        <w:t>If wrong:</w:t>
-      </w:r>
-    </w:p>
-    <w:p>
-      <w:r>
-        <w:rPr>
-          <w:rFonts w:ascii="Segoe UI Emoji" w:hAnsi="Segoe UI Emoji" w:cs="Segoe UI Emoji"/>
-        </w:rPr>
-        <w:t>❌</w:t>
-      </w:r>
-      <w:r>
-        <w:t xml:space="preserve"> Lose </w:t>
-      </w:r>
-      <w:r>
-        <w:rPr>
-          <w:b/>
-          <w:bCs/>
-        </w:rPr>
-        <w:t>1 life</w:t>
-      </w:r>
-      <w:r>
-        <w:t>.</w:t>
-      </w:r>
-    </w:p>
-    <w:p>
-      <w:r>
-        <w:t>Continue playing.</w:t>
-      </w:r>
-    </w:p>
-    <w:p>
-      <w:r>
-        <w:pict w14:anchorId="1DB1B685">
-          <v:rect id="_x0000_i1148" style="width:0;height:1.5pt" o:hralign="center" o:hrstd="t" o:hr="t" fillcolor="#a0a0a0" stroked="f"/>
-        </w:pict>
-      </w:r>
-    </w:p>
-    <w:p>
-      <w:pPr>
-        <w:rPr>
-          <w:b/>
-          <w:bCs/>
-        </w:rPr>
-      </w:pPr>
-      <w:r>
-        <w:rPr>
-          <w:b/>
-          <w:bCs/>
-        </w:rPr>
-        <w:t xml:space="preserve">3. Clues </w:t>
-      </w:r>
-      <w:r>
-        <w:rPr>
-          <w:rFonts w:ascii="Segoe UI Emoji" w:hAnsi="Segoe UI Emoji" w:cs="Segoe UI Emoji"/>
-          <w:b/>
-          <w:bCs/>
-        </w:rPr>
-        <w:t>✅</w:t>
-      </w:r>
-    </w:p>
-    <w:p>
-      <w:r>
-        <w:t>Maximum:</w:t>
-      </w:r>
-    </w:p>
-    <w:p>
-      <w:pPr>
-        <w:rPr>
-          <w:b/>
-          <w:bCs/>
-        </w:rPr>
-      </w:pPr>
-      <w:r>
-        <w:rPr>
-          <w:b/>
-          <w:bCs/>
-        </w:rPr>
-        <w:t>3 clues per round</w:t>
-      </w:r>
-    </w:p>
-    <w:p>
-      <w:r>
-        <w:t>Player presses</w:t>
-      </w:r>
-    </w:p>
-    <w:p>
-      <w:r>
-        <w:t>Ask For Clue</w:t>
-      </w:r>
-    </w:p>
-    <w:p>
-      <w:r>
-        <w:t>↓</w:t>
-      </w:r>
-    </w:p>
-    <w:p>
-      <w:r>
-        <w:t>Player 2 receives</w:t>
-      </w:r>
-    </w:p>
-    <w:p>
-      <w:r>
-        <w:t>Player requested a clue.</w:t>
-      </w:r>
-    </w:p>
-    <w:p/>
-    <w:p>
-      <w:r>
-        <w:t>Type clue</w:t>
-      </w:r>
-    </w:p>
-    <w:p/>
-    <w:p>
-      <w:r>
-        <w:t>______________</w:t>
-      </w:r>
-    </w:p>
-    <w:p/>
-    <w:p>
-      <w:r>
-        <w:t>[Send]</w:t>
-      </w:r>
-    </w:p>
-    <w:p>
-      <w:r>
-        <w:t>Game continues while Player 2 is typing.</w:t>
-      </w:r>
-    </w:p>
-    <w:p>
-      <w:r>
-        <w:t>When submitted</w:t>
-      </w:r>
-    </w:p>
-    <w:p>
-      <w:r>
-        <w:t>↓</w:t>
-      </w:r>
-    </w:p>
-    <w:p>
-      <w:r>
-        <w:t>Both players instantly see</w:t>
-      </w:r>
-    </w:p>
-    <w:p>
-      <w:r>
-        <w:t>Clue 1</w:t>
-      </w:r>
-    </w:p>
-    <w:p/>
-    <w:p>
-      <w:r>
-        <w:t>Released in 2014</w:t>
-      </w:r>
-    </w:p>
-    <w:p>
-      <w:r>
-        <w:pict w14:anchorId="45B3D4EC">
-          <v:rect id="_x0000_i1149" style="width:0;height:1.5pt" o:hralign="center" o:hrstd="t" o:hr="t" fillcolor="#a0a0a0" stroked="f"/>
-        </w:pict>
-      </w:r>
-    </w:p>
-    <w:p>
-      <w:pPr>
-        <w:rPr>
-          <w:b/>
-          <w:bCs/>
-        </w:rPr>
-      </w:pPr>
-      <w:r>
-        <w:rPr>
-          <w:b/>
-          <w:bCs/>
-        </w:rPr>
-        <w:t xml:space="preserve">4. Multiple Word Support </w:t>
-      </w:r>
-      <w:r>
-        <w:rPr>
-          <w:rFonts w:ascii="Segoe UI Emoji" w:hAnsi="Segoe UI Emoji" w:cs="Segoe UI Emoji"/>
-          <w:b/>
-          <w:bCs/>
-        </w:rPr>
-        <w:t>✅</w:t>
-      </w:r>
-    </w:p>
-    <w:p>
-      <w:r>
-        <w:t>This is a really nice feature.</w:t>
-      </w:r>
-    </w:p>
-    <w:p>
-      <w:r>
-        <w:t>Example</w:t>
-      </w:r>
-    </w:p>
-    <w:p>
-      <w:r>
-        <w:t>Secret word</w:t>
-      </w:r>
-    </w:p>
-    <w:p>
-      <w:r>
-        <w:t>HARRY POTTER</w:t>
-      </w:r>
-    </w:p>
-    <w:p>
-      <w:r>
-        <w:t>Player sees</w:t>
-      </w:r>
-    </w:p>
-    <w:p>
-      <w:r>
-        <w:t>_ _ _ _ _     _ _ _ _ _ _</w:t>
-      </w:r>
-    </w:p>
-    <w:p>
-      <w:r>
-        <w:t>Notice</w:t>
-      </w:r>
-    </w:p>
-    <w:p>
-      <w:r>
-        <w:t xml:space="preserve">The </w:t>
-      </w:r>
-      <w:r>
-        <w:rPr>
-          <w:b/>
-          <w:bCs/>
-        </w:rPr>
-        <w:t>space is visible from the beginning.</w:t>
-      </w:r>
-    </w:p>
-    <w:p>
-      <w:r>
-        <w:t>Same for</w:t>
-      </w:r>
-    </w:p>
-    <w:p>
-      <w:r>
-        <w:t>RED DEAD REDEMPTION</w:t>
-      </w:r>
-    </w:p>
-    <w:p>
-      <w:r>
-        <w:t>Display</w:t>
-      </w:r>
-    </w:p>
-    <w:p>
-      <w:r>
-        <w:t>_ _ _     _ _ _ _     _ _ _ _ _ _ _ _ _ _</w:t>
-      </w:r>
-    </w:p>
-    <w:p>
-      <w:r>
-        <w:t>No guessing required for spaces.</w:t>
-      </w:r>
-    </w:p>
-    <w:p>
-      <w:r>
-        <w:pict w14:anchorId="1EFC3BF3">
-          <v:rect id="_x0000_i1150" style="width:0;height:1.5pt" o:hralign="center" o:hrstd="t" o:hr="t" fillcolor="#a0a0a0" stroked="f"/>
-        </w:pict>
-      </w:r>
-    </w:p>
-    <w:p>
-      <w:pPr>
-        <w:rPr>
-          <w:b/>
-          <w:bCs/>
-        </w:rPr>
-      </w:pPr>
-      <w:r>
-        <w:rPr>
-          <w:b/>
-          <w:bCs/>
-        </w:rPr>
         <w:t>5. Allowed Characters</w:t>
       </w:r>
     </w:p>
@@ -2143,7 +2143,7 @@
     <w:p>
       <w:r>
         <w:pict w14:anchorId="4D94A76D">
-          <v:rect id="_x0000_i1151" style="width:0;height:1.5pt" o:hralign="center" o:hrstd="t" o:hr="t" fillcolor="#a0a0a0" stroked="f"/>
+          <v:rect id="_x0000_i1039" style="width:0;height:1.5pt" o:hralign="center" o:hrstd="t" o:hr="t" fillcolor="#a0a0a0" stroked="f"/>
         </w:pict>
       </w:r>
     </w:p>
@@ -2175,7 +2175,7 @@
     <w:p>
       <w:r>
         <w:pict w14:anchorId="5AE7EBBE">
-          <v:rect id="_x0000_i1152" style="width:0;height:1.5pt" o:hralign="center" o:hrstd="t" o:hr="t" fillcolor="#a0a0a0" stroked="f"/>
+          <v:rect id="_x0000_i1040" style="width:0;height:1.5pt" o:hralign="center" o:hrstd="t" o:hr="t" fillcolor="#a0a0a0" stroked="f"/>
         </w:pict>
       </w:r>
     </w:p>
@@ -2217,7 +2217,7 @@
     <w:p>
       <w:r>
         <w:pict w14:anchorId="0E4BCE7D">
-          <v:rect id="_x0000_i1153" style="width:0;height:1.5pt" o:hralign="center" o:hrstd="t" o:hr="t" fillcolor="#a0a0a0" stroked="f"/>
+          <v:rect id="_x0000_i1041" style="width:0;height:1.5pt" o:hralign="center" o:hrstd="t" o:hr="t" fillcolor="#a0a0a0" stroked="f"/>
         </w:pict>
       </w:r>
     </w:p>
@@ -2297,7 +2297,7 @@
     <w:p>
       <w:r>
         <w:pict w14:anchorId="71548E53">
-          <v:rect id="_x0000_i1359" style="width:0;height:1.5pt" o:hralign="center" o:hrstd="t" o:hr="t" fillcolor="#a0a0a0" stroked="f"/>
+          <v:rect id="_x0000_i1042" style="width:0;height:1.5pt" o:hralign="center" o:hrstd="t" o:hr="t" fillcolor="#a0a0a0" stroked="f"/>
         </w:pict>
       </w:r>
     </w:p>
@@ -2460,7 +2460,7 @@
     <w:p>
       <w:r>
         <w:pict w14:anchorId="53E4F066">
-          <v:rect id="_x0000_i1360" style="width:0;height:1.5pt" o:hralign="center" o:hrstd="t" o:hr="t" fillcolor="#a0a0a0" stroked="f"/>
+          <v:rect id="_x0000_i1043" style="width:0;height:1.5pt" o:hralign="center" o:hrstd="t" o:hr="t" fillcolor="#a0a0a0" stroked="f"/>
         </w:pict>
       </w:r>
     </w:p>
@@ -2580,7 +2580,7 @@
     <w:p>
       <w:r>
         <w:pict w14:anchorId="10E768C7">
-          <v:rect id="_x0000_i1361" style="width:0;height:1.5pt" o:hralign="center" o:hrstd="t" o:hr="t" fillcolor="#a0a0a0" stroked="f"/>
+          <v:rect id="_x0000_i1044" style="width:0;height:1.5pt" o:hralign="center" o:hrstd="t" o:hr="t" fillcolor="#a0a0a0" stroked="f"/>
         </w:pict>
       </w:r>
     </w:p>
@@ -2734,7 +2734,7 @@
     <w:p>
       <w:r>
         <w:pict w14:anchorId="18AB471A">
-          <v:rect id="_x0000_i1362" style="width:0;height:1.5pt" o:hralign="center" o:hrstd="t" o:hr="t" fillcolor="#a0a0a0" stroked="f"/>
+          <v:rect id="_x0000_i1045" style="width:0;height:1.5pt" o:hralign="center" o:hrstd="t" o:hr="t" fillcolor="#a0a0a0" stroked="f"/>
         </w:pict>
       </w:r>
     </w:p>
@@ -2889,7 +2889,7 @@
     <w:p>
       <w:r>
         <w:pict w14:anchorId="7DD37BBF">
-          <v:rect id="_x0000_i1363" style="width:0;height:1.5pt" o:hralign="center" o:hrstd="t" o:hr="t" fillcolor="#a0a0a0" stroked="f"/>
+          <v:rect id="_x0000_i1046" style="width:0;height:1.5pt" o:hralign="center" o:hrstd="t" o:hr="t" fillcolor="#a0a0a0" stroked="f"/>
         </w:pict>
       </w:r>
     </w:p>
@@ -3009,7 +3009,7 @@
     <w:p>
       <w:r>
         <w:pict w14:anchorId="353F3D48">
-          <v:rect id="_x0000_i1364" style="width:0;height:1.5pt" o:hralign="center" o:hrstd="t" o:hr="t" fillcolor="#a0a0a0" stroked="f"/>
+          <v:rect id="_x0000_i1047" style="width:0;height:1.5pt" o:hralign="center" o:hrstd="t" o:hr="t" fillcolor="#a0a0a0" stroked="f"/>
         </w:pict>
       </w:r>
     </w:p>
@@ -3126,7 +3126,7 @@
     <w:p>
       <w:r>
         <w:pict w14:anchorId="561EC667">
-          <v:rect id="_x0000_i1365" style="width:0;height:1.5pt" o:hralign="center" o:hrstd="t" o:hr="t" fillcolor="#a0a0a0" stroked="f"/>
+          <v:rect id="_x0000_i1048" style="width:0;height:1.5pt" o:hralign="center" o:hrstd="t" o:hr="t" fillcolor="#a0a0a0" stroked="f"/>
         </w:pict>
       </w:r>
     </w:p>
@@ -3159,7 +3159,7 @@
     <w:p>
       <w:r>
         <w:pict w14:anchorId="75AE2FB0">
-          <v:rect id="_x0000_i1366" style="width:0;height:1.5pt" o:hralign="center" o:hrstd="t" o:hr="t" fillcolor="#a0a0a0" stroked="f"/>
+          <v:rect id="_x0000_i1049" style="width:0;height:1.5pt" o:hralign="center" o:hrstd="t" o:hr="t" fillcolor="#a0a0a0" stroked="f"/>
         </w:pict>
       </w:r>
     </w:p>
@@ -3187,7 +3187,7 @@
     <w:p>
       <w:r>
         <w:pict w14:anchorId="36685DB6">
-          <v:rect id="_x0000_i1367" style="width:0;height:1.5pt" o:hralign="center" o:hrstd="t" o:hr="t" fillcolor="#a0a0a0" stroked="f"/>
+          <v:rect id="_x0000_i1050" style="width:0;height:1.5pt" o:hralign="center" o:hrstd="t" o:hr="t" fillcolor="#a0a0a0" stroked="f"/>
         </w:pict>
       </w:r>
     </w:p>
@@ -3214,7 +3214,7 @@
     <w:p>
       <w:r>
         <w:pict w14:anchorId="5CDFE2D0">
-          <v:rect id="_x0000_i1368" style="width:0;height:1.5pt" o:hralign="center" o:hrstd="t" o:hr="t" fillcolor="#a0a0a0" stroked="f"/>
+          <v:rect id="_x0000_i1051" style="width:0;height:1.5pt" o:hralign="center" o:hrstd="t" o:hr="t" fillcolor="#a0a0a0" stroked="f"/>
         </w:pict>
       </w:r>
     </w:p>
@@ -3246,7 +3246,7 @@
     <w:p>
       <w:r>
         <w:pict w14:anchorId="140D1B49">
-          <v:rect id="_x0000_i1369" style="width:0;height:1.5pt" o:hralign="center" o:hrstd="t" o:hr="t" fillcolor="#a0a0a0" stroked="f"/>
+          <v:rect id="_x0000_i1052" style="width:0;height:1.5pt" o:hralign="center" o:hrstd="t" o:hr="t" fillcolor="#a0a0a0" stroked="f"/>
         </w:pict>
       </w:r>
     </w:p>
@@ -3289,7 +3289,7 @@
     <w:p>
       <w:r>
         <w:pict w14:anchorId="55DC6B34">
-          <v:rect id="_x0000_i1370" style="width:0;height:1.5pt" o:hralign="center" o:hrstd="t" o:hr="t" fillcolor="#a0a0a0" stroked="f"/>
+          <v:rect id="_x0000_i1053" style="width:0;height:1.5pt" o:hralign="center" o:hrstd="t" o:hr="t" fillcolor="#a0a0a0" stroked="f"/>
         </w:pict>
       </w:r>
     </w:p>
@@ -3328,7 +3328,7 @@
     <w:p>
       <w:r>
         <w:pict w14:anchorId="04097FC3">
-          <v:rect id="_x0000_i1371" style="width:0;height:1.5pt" o:hralign="center" o:hrstd="t" o:hr="t" fillcolor="#a0a0a0" stroked="f"/>
+          <v:rect id="_x0000_i1054" style="width:0;height:1.5pt" o:hralign="center" o:hrstd="t" o:hr="t" fillcolor="#a0a0a0" stroked="f"/>
         </w:pict>
       </w:r>
     </w:p>
@@ -3363,7 +3363,7 @@
     <w:p>
       <w:r>
         <w:pict w14:anchorId="7B771575">
-          <v:rect id="_x0000_i1372" style="width:0;height:1.5pt" o:hralign="center" o:hrstd="t" o:hr="t" fillcolor="#a0a0a0" stroked="f"/>
+          <v:rect id="_x0000_i1055" style="width:0;height:1.5pt" o:hralign="center" o:hrstd="t" o:hr="t" fillcolor="#a0a0a0" stroked="f"/>
         </w:pict>
       </w:r>
     </w:p>
@@ -3421,7 +3421,7 @@
     <w:p>
       <w:r>
         <w:pict w14:anchorId="227F1D7F">
-          <v:rect id="_x0000_i1373" style="width:0;height:1.5pt" o:hralign="center" o:hrstd="t" o:hr="t" fillcolor="#a0a0a0" stroked="f"/>
+          <v:rect id="_x0000_i1056" style="width:0;height:1.5pt" o:hralign="center" o:hrstd="t" o:hr="t" fillcolor="#a0a0a0" stroked="f"/>
         </w:pict>
       </w:r>
     </w:p>
@@ -3455,7 +3455,7 @@
     <w:p>
       <w:r>
         <w:pict w14:anchorId="019B4B83">
-          <v:rect id="_x0000_i1374" style="width:0;height:1.5pt" o:hralign="center" o:hrstd="t" o:hr="t" fillcolor="#a0a0a0" stroked="f"/>
+          <v:rect id="_x0000_i1057" style="width:0;height:1.5pt" o:hralign="center" o:hrstd="t" o:hr="t" fillcolor="#a0a0a0" stroked="f"/>
         </w:pict>
       </w:r>
     </w:p>
@@ -3567,7 +3567,7 @@
     <w:p>
       <w:r>
         <w:pict w14:anchorId="3DAC80CF">
-          <v:rect id="_x0000_i1375" style="width:0;height:1.5pt" o:hralign="center" o:hrstd="t" o:hr="t" fillcolor="#a0a0a0" stroked="f"/>
+          <v:rect id="_x0000_i1058" style="width:0;height:1.5pt" o:hralign="center" o:hrstd="t" o:hr="t" fillcolor="#a0a0a0" stroked="f"/>
         </w:pict>
       </w:r>
     </w:p>
@@ -3667,7 +3667,7 @@
     <w:p>
       <w:r>
         <w:pict w14:anchorId="1DD66317">
-          <v:rect id="_x0000_i1376" style="width:0;height:1.5pt" o:hralign="center" o:hrstd="t" o:hr="t" fillcolor="#a0a0a0" stroked="f"/>
+          <v:rect id="_x0000_i1059" style="width:0;height:1.5pt" o:hralign="center" o:hrstd="t" o:hr="t" fillcolor="#a0a0a0" stroked="f"/>
         </w:pict>
       </w:r>
     </w:p>
@@ -3785,7 +3785,7 @@
     <w:p>
       <w:r>
         <w:pict w14:anchorId="44A418C9">
-          <v:rect id="_x0000_i1377" style="width:0;height:1.5pt" o:hralign="center" o:hrstd="t" o:hr="t" fillcolor="#a0a0a0" stroked="f"/>
+          <v:rect id="_x0000_i1060" style="width:0;height:1.5pt" o:hralign="center" o:hrstd="t" o:hr="t" fillcolor="#a0a0a0" stroked="f"/>
         </w:pict>
       </w:r>
     </w:p>
@@ -3849,7 +3849,7 @@
     <w:p>
       <w:r>
         <w:pict w14:anchorId="6657B008">
-          <v:rect id="_x0000_i1378" style="width:0;height:1.5pt" o:hralign="center" o:hrstd="t" o:hr="t" fillcolor="#a0a0a0" stroked="f"/>
+          <v:rect id="_x0000_i1061" style="width:0;height:1.5pt" o:hralign="center" o:hrstd="t" o:hr="t" fillcolor="#a0a0a0" stroked="f"/>
         </w:pict>
       </w:r>
     </w:p>
@@ -3911,7 +3911,7 @@
     <w:p>
       <w:r>
         <w:pict w14:anchorId="4D091B04">
-          <v:rect id="_x0000_i1379" style="width:0;height:1.5pt" o:hralign="center" o:hrstd="t" o:hr="t" fillcolor="#a0a0a0" stroked="f"/>
+          <v:rect id="_x0000_i1062" style="width:0;height:1.5pt" o:hralign="center" o:hrstd="t" o:hr="t" fillcolor="#a0a0a0" stroked="f"/>
         </w:pict>
       </w:r>
     </w:p>
@@ -3977,7 +3977,7 @@
     <w:p>
       <w:r>
         <w:pict w14:anchorId="715E48CF">
-          <v:rect id="_x0000_i1380" style="width:0;height:1.5pt" o:hralign="center" o:hrstd="t" o:hr="t" fillcolor="#a0a0a0" stroked="f"/>
+          <v:rect id="_x0000_i1063" style="width:0;height:1.5pt" o:hralign="center" o:hrstd="t" o:hr="t" fillcolor="#a0a0a0" stroked="f"/>
         </w:pict>
       </w:r>
     </w:p>
@@ -4032,7 +4032,7 @@
     <w:p>
       <w:r>
         <w:pict w14:anchorId="491C1DAB">
-          <v:rect id="_x0000_i1381" style="width:0;height:1.5pt" o:hralign="center" o:hrstd="t" o:hr="t" fillcolor="#a0a0a0" stroked="f"/>
+          <v:rect id="_x0000_i1064" style="width:0;height:1.5pt" o:hralign="center" o:hrstd="t" o:hr="t" fillcolor="#a0a0a0" stroked="f"/>
         </w:pict>
       </w:r>
     </w:p>
@@ -4114,7 +4114,7 @@
     <w:p>
       <w:r>
         <w:pict w14:anchorId="56AAF552">
-          <v:rect id="_x0000_i1382" style="width:0;height:1.5pt" o:hralign="center" o:hrstd="t" o:hr="t" fillcolor="#a0a0a0" stroked="f"/>
+          <v:rect id="_x0000_i1065" style="width:0;height:1.5pt" o:hralign="center" o:hrstd="t" o:hr="t" fillcolor="#a0a0a0" stroked="f"/>
         </w:pict>
       </w:r>
     </w:p>
@@ -4164,7 +4164,7 @@
     <w:p>
       <w:r>
         <w:pict w14:anchorId="77924093">
-          <v:rect id="_x0000_i1383" style="width:0;height:1.5pt" o:hralign="center" o:hrstd="t" o:hr="t" fillcolor="#a0a0a0" stroked="f"/>
+          <v:rect id="_x0000_i1066" style="width:0;height:1.5pt" o:hralign="center" o:hrstd="t" o:hr="t" fillcolor="#a0a0a0" stroked="f"/>
         </w:pict>
       </w:r>
     </w:p>
@@ -4191,7 +4191,7 @@
     <w:p>
       <w:r>
         <w:pict w14:anchorId="40C435EC">
-          <v:rect id="_x0000_i1384" style="width:0;height:1.5pt" o:hralign="center" o:hrstd="t" o:hr="t" fillcolor="#a0a0a0" stroked="f"/>
+          <v:rect id="_x0000_i1067" style="width:0;height:1.5pt" o:hralign="center" o:hrstd="t" o:hr="t" fillcolor="#a0a0a0" stroked="f"/>
         </w:pict>
       </w:r>
     </w:p>
@@ -4219,7 +4219,7 @@
     <w:p>
       <w:r>
         <w:pict w14:anchorId="42557594">
-          <v:rect id="_x0000_i1385" style="width:0;height:1.5pt" o:hralign="center" o:hrstd="t" o:hr="t" fillcolor="#a0a0a0" stroked="f"/>
+          <v:rect id="_x0000_i1068" style="width:0;height:1.5pt" o:hralign="center" o:hrstd="t" o:hr="t" fillcolor="#a0a0a0" stroked="f"/>
         </w:pict>
       </w:r>
     </w:p>
@@ -4246,7 +4246,7 @@
     <w:p>
       <w:r>
         <w:pict w14:anchorId="638C763F">
-          <v:rect id="_x0000_i1386" style="width:0;height:1.5pt" o:hralign="center" o:hrstd="t" o:hr="t" fillcolor="#a0a0a0" stroked="f"/>
+          <v:rect id="_x0000_i1069" style="width:0;height:1.5pt" o:hralign="center" o:hrstd="t" o:hr="t" fillcolor="#a0a0a0" stroked="f"/>
         </w:pict>
       </w:r>
     </w:p>
@@ -4273,7 +4273,7 @@
     <w:p>
       <w:r>
         <w:pict w14:anchorId="1EA133AB">
-          <v:rect id="_x0000_i1387" style="width:0;height:1.5pt" o:hralign="center" o:hrstd="t" o:hr="t" fillcolor="#a0a0a0" stroked="f"/>
+          <v:rect id="_x0000_i1070" style="width:0;height:1.5pt" o:hralign="center" o:hrstd="t" o:hr="t" fillcolor="#a0a0a0" stroked="f"/>
         </w:pict>
       </w:r>
     </w:p>
@@ -4300,7 +4300,7 @@
     <w:p>
       <w:r>
         <w:pict w14:anchorId="2947E65D">
-          <v:rect id="_x0000_i1388" style="width:0;height:1.5pt" o:hralign="center" o:hrstd="t" o:hr="t" fillcolor="#a0a0a0" stroked="f"/>
+          <v:rect id="_x0000_i1071" style="width:0;height:1.5pt" o:hralign="center" o:hrstd="t" o:hr="t" fillcolor="#a0a0a0" stroked="f"/>
         </w:pict>
       </w:r>
     </w:p>
@@ -4360,7 +4360,7 @@
     <w:p>
       <w:r>
         <w:pict w14:anchorId="465D3CF3">
-          <v:rect id="_x0000_i1389" style="width:0;height:1.5pt" o:hralign="center" o:hrstd="t" o:hr="t" fillcolor="#a0a0a0" stroked="f"/>
+          <v:rect id="_x0000_i1072" style="width:0;height:1.5pt" o:hralign="center" o:hrstd="t" o:hr="t" fillcolor="#a0a0a0" stroked="f"/>
         </w:pict>
       </w:r>
     </w:p>
@@ -4420,7 +4420,7 @@
     <w:p>
       <w:r>
         <w:pict w14:anchorId="01F814D7">
-          <v:rect id="_x0000_i1390" style="width:0;height:1.5pt" o:hralign="center" o:hrstd="t" o:hr="t" fillcolor="#a0a0a0" stroked="f"/>
+          <v:rect id="_x0000_i1073" style="width:0;height:1.5pt" o:hralign="center" o:hrstd="t" o:hr="t" fillcolor="#a0a0a0" stroked="f"/>
         </w:pict>
       </w:r>
     </w:p>
@@ -4529,7 +4529,7 @@
     <w:p>
       <w:r>
         <w:pict w14:anchorId="2544386D">
-          <v:rect id="_x0000_i1391" style="width:0;height:1.5pt" o:hralign="center" o:hrstd="t" o:hr="t" fillcolor="#a0a0a0" stroked="f"/>
+          <v:rect id="_x0000_i1074" style="width:0;height:1.5pt" o:hralign="center" o:hrstd="t" o:hr="t" fillcolor="#a0a0a0" stroked="f"/>
         </w:pict>
       </w:r>
     </w:p>
@@ -5270,7 +5270,7 @@
     <w:p>
       <w:r>
         <w:pict w14:anchorId="6024A2EC">
-          <v:rect id="_x0000_i1467" style="width:0;height:1.5pt" o:hralign="center" o:hrstd="t" o:hr="t" fillcolor="#a0a0a0" stroked="f"/>
+          <v:rect id="_x0000_i1075" style="width:0;height:1.5pt" o:hralign="center" o:hrstd="t" o:hr="t" fillcolor="#a0a0a0" stroked="f"/>
         </w:pict>
       </w:r>
     </w:p>
@@ -5355,7 +5355,7 @@
     <w:p>
       <w:r>
         <w:pict w14:anchorId="788B328A">
-          <v:rect id="_x0000_i1468" style="width:0;height:1.5pt" o:hralign="center" o:hrstd="t" o:hr="t" fillcolor="#a0a0a0" stroked="f"/>
+          <v:rect id="_x0000_i1076" style="width:0;height:1.5pt" o:hralign="center" o:hrstd="t" o:hr="t" fillcolor="#a0a0a0" stroked="f"/>
         </w:pict>
       </w:r>
     </w:p>
@@ -5452,7 +5452,7 @@
     <w:p>
       <w:r>
         <w:pict w14:anchorId="0F1ECD2D">
-          <v:rect id="_x0000_i1469" style="width:0;height:1.5pt" o:hralign="center" o:hrstd="t" o:hr="t" fillcolor="#a0a0a0" stroked="f"/>
+          <v:rect id="_x0000_i1077" style="width:0;height:1.5pt" o:hralign="center" o:hrstd="t" o:hr="t" fillcolor="#a0a0a0" stroked="f"/>
         </w:pict>
       </w:r>
     </w:p>
@@ -5526,7 +5526,7 @@
     <w:p>
       <w:r>
         <w:pict w14:anchorId="2BB1E056">
-          <v:rect id="_x0000_i1470" style="width:0;height:1.5pt" o:hralign="center" o:hrstd="t" o:hr="t" fillcolor="#a0a0a0" stroked="f"/>
+          <v:rect id="_x0000_i1078" style="width:0;height:1.5pt" o:hralign="center" o:hrstd="t" o:hr="t" fillcolor="#a0a0a0" stroked="f"/>
         </w:pict>
       </w:r>
     </w:p>
@@ -5600,7 +5600,7 @@
     <w:p>
       <w:r>
         <w:pict w14:anchorId="61F8046E">
-          <v:rect id="_x0000_i1471" style="width:0;height:1.5pt" o:hralign="center" o:hrstd="t" o:hr="t" fillcolor="#a0a0a0" stroked="f"/>
+          <v:rect id="_x0000_i1079" style="width:0;height:1.5pt" o:hralign="center" o:hrstd="t" o:hr="t" fillcolor="#a0a0a0" stroked="f"/>
         </w:pict>
       </w:r>
     </w:p>
@@ -5728,7 +5728,7 @@
     <w:p>
       <w:r>
         <w:pict w14:anchorId="02CECADA">
-          <v:rect id="_x0000_i1472" style="width:0;height:1.5pt" o:hralign="center" o:hrstd="t" o:hr="t" fillcolor="#a0a0a0" stroked="f"/>
+          <v:rect id="_x0000_i1080" style="width:0;height:1.5pt" o:hralign="center" o:hrstd="t" o:hr="t" fillcolor="#a0a0a0" stroked="f"/>
         </w:pict>
       </w:r>
     </w:p>
@@ -5852,7 +5852,7 @@
     <w:p>
       <w:r>
         <w:pict w14:anchorId="5248CD55">
-          <v:rect id="_x0000_i1473" style="width:0;height:1.5pt" o:hralign="center" o:hrstd="t" o:hr="t" fillcolor="#a0a0a0" stroked="f"/>
+          <v:rect id="_x0000_i1081" style="width:0;height:1.5pt" o:hralign="center" o:hrstd="t" o:hr="t" fillcolor="#a0a0a0" stroked="f"/>
         </w:pict>
       </w:r>
     </w:p>
@@ -6002,7 +6002,7 @@
     <w:p>
       <w:r>
         <w:pict w14:anchorId="3EA07C4B">
-          <v:rect id="_x0000_i1541" style="width:0;height:1.5pt" o:hralign="center" o:hrstd="t" o:hr="t" fillcolor="#a0a0a0" stroked="f"/>
+          <v:rect id="_x0000_i1082" style="width:0;height:1.5pt" o:hralign="center" o:hrstd="t" o:hr="t" fillcolor="#a0a0a0" stroked="f"/>
         </w:pict>
       </w:r>
     </w:p>
@@ -6097,7 +6097,7 @@
       <w:r>
         <w:lastRenderedPageBreak/>
         <w:pict w14:anchorId="2DCD0E7B">
-          <v:rect id="_x0000_i1542" style="width:0;height:1.5pt" o:hralign="center" o:hrstd="t" o:hr="t" fillcolor="#a0a0a0" stroked="f"/>
+          <v:rect id="_x0000_i1083" style="width:0;height:1.5pt" o:hralign="center" o:hrstd="t" o:hr="t" fillcolor="#a0a0a0" stroked="f"/>
         </w:pict>
       </w:r>
     </w:p>
@@ -6582,7 +6582,7 @@
     <w:p>
       <w:r>
         <w:pict w14:anchorId="2EB1583B">
-          <v:rect id="_x0000_i1543" style="width:0;height:1.5pt" o:hralign="center" o:hrstd="t" o:hr="t" fillcolor="#a0a0a0" stroked="f"/>
+          <v:rect id="_x0000_i1084" style="width:0;height:1.5pt" o:hralign="center" o:hrstd="t" o:hr="t" fillcolor="#a0a0a0" stroked="f"/>
         </w:pict>
       </w:r>
     </w:p>
@@ -6831,7 +6831,7 @@
     <w:p>
       <w:r>
         <w:pict w14:anchorId="64929737">
-          <v:rect id="_x0000_i1544" style="width:0;height:1.5pt" o:hralign="center" o:hrstd="t" o:hr="t" fillcolor="#a0a0a0" stroked="f"/>
+          <v:rect id="_x0000_i1085" style="width:0;height:1.5pt" o:hralign="center" o:hrstd="t" o:hr="t" fillcolor="#a0a0a0" stroked="f"/>
         </w:pict>
       </w:r>
     </w:p>
@@ -6977,7 +6977,7 @@
     <w:p>
       <w:r>
         <w:pict w14:anchorId="66BFF344">
-          <v:rect id="_x0000_i1545" style="width:0;height:1.5pt" o:hralign="center" o:hrstd="t" o:hr="t" fillcolor="#a0a0a0" stroked="f"/>
+          <v:rect id="_x0000_i1086" style="width:0;height:1.5pt" o:hralign="center" o:hrstd="t" o:hr="t" fillcolor="#a0a0a0" stroked="f"/>
         </w:pict>
       </w:r>
     </w:p>
@@ -7080,7 +7080,7 @@
     <w:p>
       <w:r>
         <w:pict w14:anchorId="6CE4732F">
-          <v:rect id="_x0000_i1546" style="width:0;height:1.5pt" o:hralign="center" o:hrstd="t" o:hr="t" fillcolor="#a0a0a0" stroked="f"/>
+          <v:rect id="_x0000_i1087" style="width:0;height:1.5pt" o:hralign="center" o:hrstd="t" o:hr="t" fillcolor="#a0a0a0" stroked="f"/>
         </w:pict>
       </w:r>
     </w:p>
@@ -7224,7 +7224,7 @@
     <w:p>
       <w:r>
         <w:pict w14:anchorId="1323B91B">
-          <v:rect id="_x0000_i1547" style="width:0;height:1.5pt" o:hralign="center" o:hrstd="t" o:hr="t" fillcolor="#a0a0a0" stroked="f"/>
+          <v:rect id="_x0000_i1088" style="width:0;height:1.5pt" o:hralign="center" o:hrstd="t" o:hr="t" fillcolor="#a0a0a0" stroked="f"/>
         </w:pict>
       </w:r>
     </w:p>
@@ -7269,7 +7269,7 @@
     <w:p>
       <w:r>
         <w:pict w14:anchorId="5C80EAFE">
-          <v:rect id="_x0000_i1548" style="width:0;height:1.5pt" o:hralign="center" o:hrstd="t" o:hr="t" fillcolor="#a0a0a0" stroked="f"/>
+          <v:rect id="_x0000_i1089" style="width:0;height:1.5pt" o:hralign="center" o:hrstd="t" o:hr="t" fillcolor="#a0a0a0" stroked="f"/>
         </w:pict>
       </w:r>
     </w:p>
@@ -7347,7 +7347,7 @@
     <w:p>
       <w:r>
         <w:pict w14:anchorId="58C3F63A">
-          <v:rect id="_x0000_i1549" style="width:0;height:1.5pt" o:hralign="center" o:hrstd="t" o:hr="t" fillcolor="#a0a0a0" stroked="f"/>
+          <v:rect id="_x0000_i1090" style="width:0;height:1.5pt" o:hralign="center" o:hrstd="t" o:hr="t" fillcolor="#a0a0a0" stroked="f"/>
         </w:pict>
       </w:r>
     </w:p>
@@ -7940,7 +7940,7 @@
           <w:bCs/>
         </w:rPr>
         <w:pict w14:anchorId="07A2F792">
-          <v:rect id="_x0000_i1664" style="width:0;height:1.5pt" o:hralign="center" o:hrstd="t" o:hr="t" fillcolor="#a0a0a0" stroked="f"/>
+          <v:rect id="_x0000_i1091" style="width:0;height:1.5pt" o:hralign="center" o:hrstd="t" o:hr="t" fillcolor="#a0a0a0" stroked="f"/>
         </w:pict>
       </w:r>
     </w:p>
@@ -8101,7 +8101,7 @@
           <w:bCs/>
         </w:rPr>
         <w:pict w14:anchorId="120047CD">
-          <v:rect id="_x0000_i1665" style="width:0;height:1.5pt" o:hralign="center" o:hrstd="t" o:hr="t" fillcolor="#a0a0a0" stroked="f"/>
+          <v:rect id="_x0000_i1092" style="width:0;height:1.5pt" o:hralign="center" o:hrstd="t" o:hr="t" fillcolor="#a0a0a0" stroked="f"/>
         </w:pict>
       </w:r>
     </w:p>
@@ -8205,7 +8205,7 @@
           <w:bCs/>
         </w:rPr>
         <w:pict w14:anchorId="2FCF39F2">
-          <v:rect id="_x0000_i1666" style="width:0;height:1.5pt" o:hralign="center" o:hrstd="t" o:hr="t" fillcolor="#a0a0a0" stroked="f"/>
+          <v:rect id="_x0000_i1093" style="width:0;height:1.5pt" o:hralign="center" o:hrstd="t" o:hr="t" fillcolor="#a0a0a0" stroked="f"/>
         </w:pict>
       </w:r>
     </w:p>
@@ -8253,7 +8253,7 @@
           <w:bCs/>
         </w:rPr>
         <w:pict w14:anchorId="3BEED4C7">
-          <v:rect id="_x0000_i1667" style="width:0;height:1.5pt" o:hralign="center" o:hrstd="t" o:hr="t" fillcolor="#a0a0a0" stroked="f"/>
+          <v:rect id="_x0000_i1094" style="width:0;height:1.5pt" o:hralign="center" o:hrstd="t" o:hr="t" fillcolor="#a0a0a0" stroked="f"/>
         </w:pict>
       </w:r>
     </w:p>
@@ -8345,7 +8345,7 @@
           <w:bCs/>
         </w:rPr>
         <w:pict w14:anchorId="5465A44B">
-          <v:rect id="_x0000_i1668" style="width:0;height:1.5pt" o:hralign="center" o:hrstd="t" o:hr="t" fillcolor="#a0a0a0" stroked="f"/>
+          <v:rect id="_x0000_i1095" style="width:0;height:1.5pt" o:hralign="center" o:hrstd="t" o:hr="t" fillcolor="#a0a0a0" stroked="f"/>
         </w:pict>
       </w:r>
     </w:p>
@@ -8468,7 +8468,7 @@
           <w:bCs/>
         </w:rPr>
         <w:pict w14:anchorId="5A5CAE75">
-          <v:rect id="_x0000_i1669" style="width:0;height:1.5pt" o:hralign="center" o:hrstd="t" o:hr="t" fillcolor="#a0a0a0" stroked="f"/>
+          <v:rect id="_x0000_i1096" style="width:0;height:1.5pt" o:hralign="center" o:hrstd="t" o:hr="t" fillcolor="#a0a0a0" stroked="f"/>
         </w:pict>
       </w:r>
     </w:p>
@@ -8610,7 +8610,7 @@
           <w:bCs/>
         </w:rPr>
         <w:pict w14:anchorId="309D96D8">
-          <v:rect id="_x0000_i1670" style="width:0;height:1.5pt" o:hralign="center" o:hrstd="t" o:hr="t" fillcolor="#a0a0a0" stroked="f"/>
+          <v:rect id="_x0000_i1097" style="width:0;height:1.5pt" o:hralign="center" o:hrstd="t" o:hr="t" fillcolor="#a0a0a0" stroked="f"/>
         </w:pict>
       </w:r>
     </w:p>
@@ -8741,7 +8741,7 @@
           <w:bCs/>
         </w:rPr>
         <w:pict w14:anchorId="28B0BC3B">
-          <v:rect id="_x0000_i1671" style="width:0;height:1.5pt" o:hralign="center" o:hrstd="t" o:hr="t" fillcolor="#a0a0a0" stroked="f"/>
+          <v:rect id="_x0000_i1098" style="width:0;height:1.5pt" o:hralign="center" o:hrstd="t" o:hr="t" fillcolor="#a0a0a0" stroked="f"/>
         </w:pict>
       </w:r>
     </w:p>
@@ -8860,7 +8860,7 @@
           <w:bCs/>
         </w:rPr>
         <w:pict w14:anchorId="1F31DC28">
-          <v:rect id="_x0000_i1672" style="width:0;height:1.5pt" o:hralign="center" o:hrstd="t" o:hr="t" fillcolor="#a0a0a0" stroked="f"/>
+          <v:rect id="_x0000_i1099" style="width:0;height:1.5pt" o:hralign="center" o:hrstd="t" o:hr="t" fillcolor="#a0a0a0" stroked="f"/>
         </w:pict>
       </w:r>
     </w:p>
@@ -9013,7 +9013,7 @@
           <w:bCs/>
         </w:rPr>
         <w:pict w14:anchorId="56D7B143">
-          <v:rect id="_x0000_i1673" style="width:0;height:1.5pt" o:hralign="center" o:hrstd="t" o:hr="t" fillcolor="#a0a0a0" stroked="f"/>
+          <v:rect id="_x0000_i1100" style="width:0;height:1.5pt" o:hralign="center" o:hrstd="t" o:hr="t" fillcolor="#a0a0a0" stroked="f"/>
         </w:pict>
       </w:r>
     </w:p>
@@ -9160,7 +9160,7 @@
           <w:bCs/>
         </w:rPr>
         <w:pict w14:anchorId="2BB8432A">
-          <v:rect id="_x0000_i1674" style="width:0;height:1.5pt" o:hralign="center" o:hrstd="t" o:hr="t" fillcolor="#a0a0a0" stroked="f"/>
+          <v:rect id="_x0000_i1101" style="width:0;height:1.5pt" o:hralign="center" o:hrstd="t" o:hr="t" fillcolor="#a0a0a0" stroked="f"/>
         </w:pict>
       </w:r>
     </w:p>
@@ -9291,7 +9291,7 @@
           <w:bCs/>
         </w:rPr>
         <w:pict w14:anchorId="56F56458">
-          <v:rect id="_x0000_i1675" style="width:0;height:1.5pt" o:hralign="center" o:hrstd="t" o:hr="t" fillcolor="#a0a0a0" stroked="f"/>
+          <v:rect id="_x0000_i1102" style="width:0;height:1.5pt" o:hralign="center" o:hrstd="t" o:hr="t" fillcolor="#a0a0a0" stroked="f"/>
         </w:pict>
       </w:r>
     </w:p>
@@ -9414,7 +9414,7 @@
           <w:bCs/>
         </w:rPr>
         <w:pict w14:anchorId="1F1765C1">
-          <v:rect id="_x0000_i1676" style="width:0;height:1.5pt" o:hralign="center" o:hrstd="t" o:hr="t" fillcolor="#a0a0a0" stroked="f"/>
+          <v:rect id="_x0000_i1103" style="width:0;height:1.5pt" o:hralign="center" o:hrstd="t" o:hr="t" fillcolor="#a0a0a0" stroked="f"/>
         </w:pict>
       </w:r>
     </w:p>
@@ -9461,7 +9461,7 @@
           <w:bCs/>
         </w:rPr>
         <w:pict w14:anchorId="5FA75229">
-          <v:rect id="_x0000_i1677" style="width:0;height:1.5pt" o:hralign="center" o:hrstd="t" o:hr="t" fillcolor="#a0a0a0" stroked="f"/>
+          <v:rect id="_x0000_i1104" style="width:0;height:1.5pt" o:hralign="center" o:hrstd="t" o:hr="t" fillcolor="#a0a0a0" stroked="f"/>
         </w:pict>
       </w:r>
     </w:p>
@@ -9584,7 +9584,7 @@
           <w:bCs/>
         </w:rPr>
         <w:pict w14:anchorId="3107DFD0">
-          <v:rect id="_x0000_i1678" style="width:0;height:1.5pt" o:hralign="center" o:hrstd="t" o:hr="t" fillcolor="#a0a0a0" stroked="f"/>
+          <v:rect id="_x0000_i1105" style="width:0;height:1.5pt" o:hralign="center" o:hrstd="t" o:hr="t" fillcolor="#a0a0a0" stroked="f"/>
         </w:pict>
       </w:r>
     </w:p>
@@ -9654,7 +9654,7 @@
           <w:bCs/>
         </w:rPr>
         <w:pict w14:anchorId="1621FE24">
-          <v:rect id="_x0000_i1679" style="width:0;height:1.5pt" o:hralign="center" o:hrstd="t" o:hr="t" fillcolor="#a0a0a0" stroked="f"/>
+          <v:rect id="_x0000_i1106" style="width:0;height:1.5pt" o:hralign="center" o:hrstd="t" o:hr="t" fillcolor="#a0a0a0" stroked="f"/>
         </w:pict>
       </w:r>
     </w:p>
@@ -9731,7 +9731,7 @@
           <w:bCs/>
         </w:rPr>
         <w:pict w14:anchorId="311F5ACF">
-          <v:rect id="_x0000_i1680" style="width:0;height:1.5pt" o:hralign="center" o:hrstd="t" o:hr="t" fillcolor="#a0a0a0" stroked="f"/>
+          <v:rect id="_x0000_i1107" style="width:0;height:1.5pt" o:hralign="center" o:hrstd="t" o:hr="t" fillcolor="#a0a0a0" stroked="f"/>
         </w:pict>
       </w:r>
     </w:p>
@@ -9795,6 +9795,338 @@
         <w:t>instead of building that UI repeatedly.</w:t>
       </w:r>
     </w:p>
+    <w:p>
+      <w:pPr>
+        <w:rPr>
+          <w:b/>
+          <w:bCs/>
+        </w:rPr>
+      </w:pPr>
+    </w:p>
+    <w:p>
+      <w:pPr>
+        <w:rPr>
+          <w:b/>
+          <w:bCs/>
+        </w:rPr>
+      </w:pPr>
+      <w:r>
+        <w:rPr>
+          <w:b/>
+          <w:bCs/>
+        </w:rPr>
+        <w:t>Libraries Need to install</w:t>
+      </w:r>
+    </w:p>
+    <w:tbl>
+      <w:tblPr>
+        <w:tblW w:w="0" w:type="auto"/>
+        <w:tblCellSpacing w:w="15" w:type="dxa"/>
+        <w:tblCellMar>
+          <w:top w:w="15" w:type="dxa"/>
+          <w:left w:w="15" w:type="dxa"/>
+          <w:bottom w:w="15" w:type="dxa"/>
+          <w:right w:w="15" w:type="dxa"/>
+        </w:tblCellMar>
+        <w:tblLook w:val="04A0" w:firstRow="1" w:lastRow="0" w:firstColumn="1" w:lastColumn="0" w:noHBand="0" w:noVBand="1"/>
+      </w:tblPr>
+      <w:tblGrid>
+        <w:gridCol w:w="1703"/>
+        <w:gridCol w:w="2635"/>
+      </w:tblGrid>
+      <w:tr>
+        <w:trPr>
+          <w:tblHeader/>
+          <w:tblCellSpacing w:w="15" w:type="dxa"/>
+        </w:trPr>
+        <w:tc>
+          <w:tcPr>
+            <w:tcW w:w="0" w:type="auto"/>
+            <w:vAlign w:val="center"/>
+            <w:hideMark/>
+          </w:tcPr>
+          <w:p>
+            <w:pPr>
+              <w:rPr>
+                <w:b/>
+                <w:bCs/>
+              </w:rPr>
+            </w:pPr>
+            <w:r>
+              <w:rPr>
+                <w:b/>
+                <w:bCs/>
+              </w:rPr>
+              <w:t>Package</w:t>
+            </w:r>
+          </w:p>
+        </w:tc>
+        <w:tc>
+          <w:tcPr>
+            <w:tcW w:w="0" w:type="auto"/>
+            <w:vAlign w:val="center"/>
+            <w:hideMark/>
+          </w:tcPr>
+          <w:p>
+            <w:pPr>
+              <w:rPr>
+                <w:b/>
+                <w:bCs/>
+              </w:rPr>
+            </w:pPr>
+            <w:r>
+              <w:rPr>
+                <w:b/>
+                <w:bCs/>
+              </w:rPr>
+              <w:t>Why</w:t>
+            </w:r>
+          </w:p>
+        </w:tc>
+      </w:tr>
+      <w:tr>
+        <w:trPr>
+          <w:tblCellSpacing w:w="15" w:type="dxa"/>
+        </w:trPr>
+        <w:tc>
+          <w:tcPr>
+            <w:tcW w:w="0" w:type="auto"/>
+            <w:vAlign w:val="center"/>
+            <w:hideMark/>
+          </w:tcPr>
+          <w:p>
+            <w:r>
+              <w:t>Tailwind CSS</w:t>
+            </w:r>
+          </w:p>
+        </w:tc>
+        <w:tc>
+          <w:tcPr>
+            <w:tcW w:w="0" w:type="auto"/>
+            <w:vAlign w:val="center"/>
+            <w:hideMark/>
+          </w:tcPr>
+          <w:p>
+            <w:r>
+              <w:t>Styling</w:t>
+            </w:r>
+          </w:p>
+        </w:tc>
+      </w:tr>
+      <w:tr>
+        <w:trPr>
+          <w:tblCellSpacing w:w="15" w:type="dxa"/>
+        </w:trPr>
+        <w:tc>
+          <w:tcPr>
+            <w:tcW w:w="0" w:type="auto"/>
+            <w:vAlign w:val="center"/>
+            <w:hideMark/>
+          </w:tcPr>
+          <w:p>
+            <w:r>
+              <w:t>React Router</w:t>
+            </w:r>
+          </w:p>
+        </w:tc>
+        <w:tc>
+          <w:tcPr>
+            <w:tcW w:w="0" w:type="auto"/>
+            <w:vAlign w:val="center"/>
+            <w:hideMark/>
+          </w:tcPr>
+          <w:p>
+            <w:r>
+              <w:t>Navigation</w:t>
+            </w:r>
+          </w:p>
+        </w:tc>
+      </w:tr>
+      <w:tr>
+        <w:trPr>
+          <w:tblCellSpacing w:w="15" w:type="dxa"/>
+        </w:trPr>
+        <w:tc>
+          <w:tcPr>
+            <w:tcW w:w="0" w:type="auto"/>
+            <w:vAlign w:val="center"/>
+            <w:hideMark/>
+          </w:tcPr>
+          <w:p>
+            <w:r>
+              <w:t>Axios</w:t>
+            </w:r>
+          </w:p>
+        </w:tc>
+        <w:tc>
+          <w:tcPr>
+            <w:tcW w:w="0" w:type="auto"/>
+            <w:vAlign w:val="center"/>
+            <w:hideMark/>
+          </w:tcPr>
+          <w:p>
+            <w:r>
+              <w:t>API calls</w:t>
+            </w:r>
+          </w:p>
+        </w:tc>
+      </w:tr>
+      <w:tr>
+        <w:trPr>
+          <w:tblCellSpacing w:w="15" w:type="dxa"/>
+        </w:trPr>
+        <w:tc>
+          <w:tcPr>
+            <w:tcW w:w="0" w:type="auto"/>
+            <w:vAlign w:val="center"/>
+            <w:hideMark/>
+          </w:tcPr>
+          <w:p>
+            <w:r>
+              <w:t>Framer Motion</w:t>
+            </w:r>
+          </w:p>
+        </w:tc>
+        <w:tc>
+          <w:tcPr>
+            <w:tcW w:w="0" w:type="auto"/>
+            <w:vAlign w:val="center"/>
+            <w:hideMark/>
+          </w:tcPr>
+          <w:p>
+            <w:r>
+              <w:t>Animations</w:t>
+            </w:r>
+          </w:p>
+        </w:tc>
+      </w:tr>
+      <w:tr>
+        <w:trPr>
+          <w:tblCellSpacing w:w="15" w:type="dxa"/>
+        </w:trPr>
+        <w:tc>
+          <w:tcPr>
+            <w:tcW w:w="0" w:type="auto"/>
+            <w:vAlign w:val="center"/>
+            <w:hideMark/>
+          </w:tcPr>
+          <w:p>
+            <w:proofErr w:type="spellStart"/>
+            <w:r>
+              <w:t>Lucide</w:t>
+            </w:r>
+            <w:proofErr w:type="spellEnd"/>
+            <w:r>
+              <w:t xml:space="preserve"> React</w:t>
+            </w:r>
+          </w:p>
+        </w:tc>
+        <w:tc>
+          <w:tcPr>
+            <w:tcW w:w="0" w:type="auto"/>
+            <w:vAlign w:val="center"/>
+            <w:hideMark/>
+          </w:tcPr>
+          <w:p>
+            <w:r>
+              <w:t>Icons</w:t>
+            </w:r>
+          </w:p>
+        </w:tc>
+      </w:tr>
+      <w:tr>
+        <w:trPr>
+          <w:tblCellSpacing w:w="15" w:type="dxa"/>
+        </w:trPr>
+        <w:tc>
+          <w:tcPr>
+            <w:tcW w:w="0" w:type="auto"/>
+            <w:vAlign w:val="center"/>
+            <w:hideMark/>
+          </w:tcPr>
+          <w:p>
+            <w:proofErr w:type="spellStart"/>
+            <w:r>
+              <w:t>Zustand</w:t>
+            </w:r>
+            <w:proofErr w:type="spellEnd"/>
+          </w:p>
+        </w:tc>
+        <w:tc>
+          <w:tcPr>
+            <w:tcW w:w="0" w:type="auto"/>
+            <w:vAlign w:val="center"/>
+            <w:hideMark/>
+          </w:tcPr>
+          <w:p>
+            <w:r>
+              <w:t>State Management</w:t>
+            </w:r>
+          </w:p>
+        </w:tc>
+      </w:tr>
+      <w:tr>
+        <w:trPr>
+          <w:tblCellSpacing w:w="15" w:type="dxa"/>
+        </w:trPr>
+        <w:tc>
+          <w:tcPr>
+            <w:tcW w:w="0" w:type="auto"/>
+            <w:vAlign w:val="center"/>
+            <w:hideMark/>
+          </w:tcPr>
+          <w:p>
+            <w:r>
+              <w:lastRenderedPageBreak/>
+              <w:t>React Hot Toast</w:t>
+            </w:r>
+          </w:p>
+        </w:tc>
+        <w:tc>
+          <w:tcPr>
+            <w:tcW w:w="0" w:type="auto"/>
+            <w:vAlign w:val="center"/>
+            <w:hideMark/>
+          </w:tcPr>
+          <w:p>
+            <w:r>
+              <w:t>Notifications</w:t>
+            </w:r>
+          </w:p>
+        </w:tc>
+      </w:tr>
+      <w:tr>
+        <w:trPr>
+          <w:tblCellSpacing w:w="15" w:type="dxa"/>
+        </w:trPr>
+        <w:tc>
+          <w:tcPr>
+            <w:tcW w:w="0" w:type="auto"/>
+            <w:vAlign w:val="center"/>
+            <w:hideMark/>
+          </w:tcPr>
+          <w:p>
+            <w:proofErr w:type="spellStart"/>
+            <w:r>
+              <w:t>clsx</w:t>
+            </w:r>
+            <w:proofErr w:type="spellEnd"/>
+          </w:p>
+        </w:tc>
+        <w:tc>
+          <w:tcPr>
+            <w:tcW w:w="0" w:type="auto"/>
+            <w:vAlign w:val="center"/>
+            <w:hideMark/>
+          </w:tcPr>
+          <w:p>
+            <w:r>
+              <w:t>Conditional class names</w:t>
+            </w:r>
+          </w:p>
+        </w:tc>
+      </w:tr>
+    </w:tbl>
     <w:p/>
     <w:sectPr>
       <w:pgSz w:w="11906" w:h="16838"/>

</xml_diff>